<commit_message>
Documentation checked for consistency and security docs: Lastenheft V6.9 – Argon2 konsolidiert, Netzwerk-Isolation in Abschnitt 14 docs: Architekturübersicht V1.4 – Docker-Netzwerke, internal:true, Security-Härtung docs: Betriebshandbuch V1.1 – GPG-Schlüssel-Management, Security-Erstinstallation docs: API-Spec V0.2.1 – x-required-roles vollständig, Network-Security-Conventions
</commit_message>
<xml_diff>
--- a/docs/Betriebshandbuch.docx
+++ b/docs/Betriebshandbuch.docx
@@ -48,7 +48,7 @@
           <w:sz w:val="22"/>
           <w:szCs w:val="22"/>
         </w:rPr>
-        <w:t xml:space="preserve">Version 1.0</w:t>
+        <w:t xml:space="preserve">Version 1.1</w:t>
       </w:r>
     </w:p>
     <w:p>
@@ -96,41 +96,7 @@
           <w:sz w:val="22"/>
           <w:szCs w:val="22"/>
         </w:rPr>
-        <w:t xml:space="preserve">Dieses Handbuch richtet sich an zwei Zielgruppen:</w:t>
-      </w:r>
-    </w:p>
-    <w:p>
-      <w:pPr>
-        <w:pStyle w:val="ListParagraph"/>
-        <w:numPr>
-          <w:ilvl w:val="0"/>
-          <w:numId w:val="2"/>
-        </w:numPr>
-      </w:pPr>
-      <w:r>
-        <w:rPr>
-          <w:rFonts w:ascii="Calibri" w:cs="Calibri" w:eastAsia="Calibri" w:hAnsi="Calibri"/>
-          <w:sz w:val="22"/>
-          <w:szCs w:val="22"/>
-        </w:rPr>
-        <w:t xml:space="preserve">Technische Abschnitte (markiert mit [ TECHNISCHER ABSCHNITT ]) erfordern Linux- und Docker-Kenntnisse und sind für den Entwickler/Betreiber bestimmt.</w:t>
-      </w:r>
-    </w:p>
-    <w:p>
-      <w:pPr>
-        <w:pStyle w:val="ListParagraph"/>
-        <w:numPr>
-          <w:ilvl w:val="0"/>
-          <w:numId w:val="2"/>
-        </w:numPr>
-      </w:pPr>
-      <w:r>
-        <w:rPr>
-          <w:rFonts w:ascii="Calibri" w:cs="Calibri" w:eastAsia="Calibri" w:hAnsi="Calibri"/>
-          <w:sz w:val="22"/>
-          <w:szCs w:val="22"/>
-        </w:rPr>
-        <w:t xml:space="preserve">Admin-Abschnitte sind für die zuständige Person der Kirchgemeinde ohne Programmierkenntnisse verständlich — es genügt ein Browser und der Zugang zum Admin-Bereich.</w:t>
+        <w:t xml:space="preserve">Technische Abschnitte (markiert mit [ TECHNISCHER ABSCHNITT ]) erfordern Linux/GPG-Kenntnisse. Admin-Abschnitte sind ohne Programmierkenntnisse verständlich.</w:t>
       </w:r>
     </w:p>
     <w:p>
@@ -171,7 +137,7 @@
           <w:sz w:val="22"/>
           <w:szCs w:val="22"/>
         </w:rPr>
-        <w:t xml:space="preserve">Das kirchliche Planungs- und Reservationssystem läuft auf einem virtuellen Server (VPS) bei Infomaniak in der Schweiz. Es ist über jeden Browser erreichbar — kein separates Programm muss installiert werden.</w:t>
+        <w:t xml:space="preserve">Das System läuft auf einem virtuellen Server (VPS) bei Infomaniak in der Schweiz und ist über jeden Browser erreichbar.</w:t>
       </w:r>
     </w:p>
     <w:p>
@@ -222,7 +188,6 @@
                 <w:rFonts w:ascii="Calibri" w:cs="Calibri" w:eastAsia="Calibri" w:hAnsi="Calibri"/>
                 <w:b/>
                 <w:bCs/>
-                <w:color w:val="000000"/>
                 <w:sz w:val="20"/>
                 <w:szCs w:val="20"/>
               </w:rPr>
@@ -253,7 +218,6 @@
                 <w:rFonts w:ascii="Calibri" w:cs="Calibri" w:eastAsia="Calibri" w:hAnsi="Calibri"/>
                 <w:b/>
                 <w:bCs/>
-                <w:color w:val="000000"/>
                 <w:sz w:val="20"/>
                 <w:szCs w:val="20"/>
               </w:rPr>
@@ -286,7 +250,6 @@
                 <w:rFonts w:ascii="Calibri" w:cs="Calibri" w:eastAsia="Calibri" w:hAnsi="Calibri"/>
                 <w:b w:val="false"/>
                 <w:bCs w:val="false"/>
-                <w:color w:val="000000"/>
                 <w:sz w:val="20"/>
                 <w:szCs w:val="20"/>
               </w:rPr>
@@ -317,7 +280,6 @@
                 <w:rFonts w:ascii="Calibri" w:cs="Calibri" w:eastAsia="Calibri" w:hAnsi="Calibri"/>
                 <w:b w:val="false"/>
                 <w:bCs w:val="false"/>
-                <w:color w:val="000000"/>
                 <w:sz w:val="20"/>
                 <w:szCs w:val="20"/>
               </w:rPr>
@@ -350,7 +312,6 @@
                 <w:rFonts w:ascii="Calibri" w:cs="Calibri" w:eastAsia="Calibri" w:hAnsi="Calibri"/>
                 <w:b w:val="false"/>
                 <w:bCs w:val="false"/>
-                <w:color w:val="000000"/>
                 <w:sz w:val="20"/>
                 <w:szCs w:val="20"/>
               </w:rPr>
@@ -381,7 +342,6 @@
                 <w:rFonts w:ascii="Calibri" w:cs="Calibri" w:eastAsia="Calibri" w:hAnsi="Calibri"/>
                 <w:b w:val="false"/>
                 <w:bCs w:val="false"/>
-                <w:color w:val="000000"/>
                 <w:sz w:val="20"/>
                 <w:szCs w:val="20"/>
               </w:rPr>
@@ -414,7 +374,6 @@
                 <w:rFonts w:ascii="Calibri" w:cs="Calibri" w:eastAsia="Calibri" w:hAnsi="Calibri"/>
                 <w:b w:val="false"/>
                 <w:bCs w:val="false"/>
-                <w:color w:val="000000"/>
                 <w:sz w:val="20"/>
                 <w:szCs w:val="20"/>
               </w:rPr>
@@ -445,7 +404,6 @@
                 <w:rFonts w:ascii="Calibri" w:cs="Calibri" w:eastAsia="Calibri" w:hAnsi="Calibri"/>
                 <w:b w:val="false"/>
                 <w:bCs w:val="false"/>
-                <w:color w:val="000000"/>
                 <w:sz w:val="20"/>
                 <w:szCs w:val="20"/>
               </w:rPr>
@@ -478,7 +436,6 @@
                 <w:rFonts w:ascii="Calibri" w:cs="Calibri" w:eastAsia="Calibri" w:hAnsi="Calibri"/>
                 <w:b w:val="false"/>
                 <w:bCs w:val="false"/>
-                <w:color w:val="000000"/>
                 <w:sz w:val="20"/>
                 <w:szCs w:val="20"/>
               </w:rPr>
@@ -509,7 +466,6 @@
                 <w:rFonts w:ascii="Calibri" w:cs="Calibri" w:eastAsia="Calibri" w:hAnsi="Calibri"/>
                 <w:b w:val="false"/>
                 <w:bCs w:val="false"/>
-                <w:color w:val="000000"/>
                 <w:sz w:val="20"/>
                 <w:szCs w:val="20"/>
               </w:rPr>
@@ -542,7 +498,6 @@
                 <w:rFonts w:ascii="Calibri" w:cs="Calibri" w:eastAsia="Calibri" w:hAnsi="Calibri"/>
                 <w:b w:val="false"/>
                 <w:bCs w:val="false"/>
-                <w:color w:val="000000"/>
                 <w:sz w:val="20"/>
                 <w:szCs w:val="20"/>
               </w:rPr>
@@ -573,7 +528,6 @@
                 <w:rFonts w:ascii="Calibri" w:cs="Calibri" w:eastAsia="Calibri" w:hAnsi="Calibri"/>
                 <w:b w:val="false"/>
                 <w:bCs w:val="false"/>
-                <w:color w:val="000000"/>
                 <w:sz w:val="20"/>
                 <w:szCs w:val="20"/>
               </w:rPr>
@@ -624,15 +578,7 @@
           <w:sz w:val="18"/>
           <w:szCs w:val="18"/>
         </w:rPr>
-        <w:t xml:space="preserve">[ TECHNISCHER ABSCHNITT — erfordert Linux/Docker-Kenntnisse ]</w:t>
-      </w:r>
-    </w:p>
-    <w:p>
-      <w:pPr>
-        <w:spacing w:after="80"/>
-      </w:pPr>
-      <w:r>
-        <w:t xml:space="preserve"/>
+        <w:t xml:space="preserve">[ TECHNISCHER ABSCHNITT — erfordert Linux/GPG-Kenntnisse ]</w:t>
       </w:r>
     </w:p>
     <w:p>
@@ -759,7 +705,7 @@
           <w:sz w:val="22"/>
           <w:szCs w:val="22"/>
         </w:rPr>
-        <w:t xml:space="preserve">Als root einloggen und System aktualisieren:</w:t>
+        <w:t xml:space="preserve">System aktualisieren:</w:t>
       </w:r>
     </w:p>
     <w:p>
@@ -791,7 +737,7 @@
           <w:sz w:val="22"/>
           <w:szCs w:val="22"/>
         </w:rPr>
-        <w:t xml:space="preserve">Docker installieren (offizielle Anleitung):</w:t>
+        <w:t xml:space="preserve">Docker installieren:</w:t>
       </w:r>
     </w:p>
     <w:p>
@@ -838,7 +784,7 @@
           <w:sz w:val="22"/>
           <w:szCs w:val="22"/>
         </w:rPr>
-        <w:t xml:space="preserve">Certbot für Let's Encrypt installieren:</w:t>
+        <w:t xml:space="preserve">Certbot installieren:</w:t>
       </w:r>
     </w:p>
     <w:p>
@@ -854,6 +800,38 @@
           <w:szCs w:val="20"/>
         </w:rPr>
         <w:t xml:space="preserve">apt install certbot python3-certbot-nginx -y</w:t>
+      </w:r>
+    </w:p>
+    <w:p>
+      <w:pPr>
+        <w:pStyle w:val="ListParagraph"/>
+        <w:numPr>
+          <w:ilvl w:val="0"/>
+          <w:numId w:val="3"/>
+        </w:numPr>
+      </w:pPr>
+      <w:r>
+        <w:rPr>
+          <w:rFonts w:ascii="Calibri" w:cs="Calibri" w:eastAsia="Calibri" w:hAnsi="Calibri"/>
+          <w:sz w:val="22"/>
+          <w:szCs w:val="22"/>
+        </w:rPr>
+        <w:t xml:space="preserve">GPG installieren (für Backup-Verschlüsselung):</w:t>
+      </w:r>
+    </w:p>
+    <w:p>
+      <w:pPr>
+        <w:shd w:fill="F0F0F0" w:val="clear"/>
+        <w:spacing w:after="40"/>
+        <w:ind w:left="480"/>
+      </w:pPr>
+      <w:r>
+        <w:rPr>
+          <w:rFonts w:ascii="Courier New" w:cs="Courier New" w:eastAsia="Courier New" w:hAnsi="Courier New"/>
+          <w:sz w:val="20"/>
+          <w:szCs w:val="20"/>
+        </w:rPr>
+        <w:t xml:space="preserve">apt install gnupg2 -y</w:t>
       </w:r>
     </w:p>
     <w:p>
@@ -972,7 +950,7 @@
           <w:sz w:val="20"/>
           <w:szCs w:val="20"/>
         </w:rPr>
-        <w:t xml:space="preserve">nano .env   # Alle Werte ausfüllen (DB-Passwort, SECRET_KEY, Domain, GPG-Key)</w:t>
+        <w:t xml:space="preserve">nano .env</w:t>
       </w:r>
     </w:p>
     <w:p>
@@ -992,7 +970,7 @@
           <w:sz w:val="20"/>
           <w:szCs w:val="20"/>
         </w:rPr>
-        <w:t xml:space="preserve">⚠ SECRET_KEY muss ein zufälliger String sein. Generieren mit: python3 -c "import secrets; print(secrets.token_hex(32))"</w:t>
+        <w:t xml:space="preserve">⚠ SECRET_KEY muss ein zufälliger String sein: python3 -c "import secrets; print(secrets.token_hex(32))"</w:t>
       </w:r>
     </w:p>
     <w:p>
@@ -1073,7 +1051,7 @@
           <w:sz w:val="22"/>
           <w:szCs w:val="22"/>
         </w:rPr>
-        <w:t xml:space="preserve">TLS-Zertifikat ausstellen:</w:t>
+        <w:t xml:space="preserve">TLS-Zertifikat:</w:t>
       </w:r>
     </w:p>
     <w:p>
@@ -1105,7 +1083,7 @@
           <w:sz w:val="22"/>
           <w:szCs w:val="22"/>
         </w:rPr>
-        <w:t xml:space="preserve">Smoke-Test: Browser öffnen → https://kirchenplanung.example.ch → Login-Seite muss erscheinen</w:t>
+        <w:t xml:space="preserve">Smoke-Test: Browser → https://kirchenplanung.example.ch → Login-Seite erscheint</w:t>
       </w:r>
     </w:p>
     <w:p>
@@ -1146,20 +1124,7 @@
           <w:sz w:val="18"/>
           <w:szCs w:val="18"/>
         </w:rPr>
-        <w:t xml:space="preserve">[ TECHNISCHER ABSCHNITT — erfordert Linux/Docker-Kenntnisse ]</w:t>
-      </w:r>
-    </w:p>
-    <w:p>
-      <w:pPr>
-        <w:spacing w:after="120"/>
-      </w:pPr>
-      <w:r>
-        <w:rPr>
-          <w:rFonts w:ascii="Calibri" w:cs="Calibri" w:eastAsia="Calibri" w:hAnsi="Calibri"/>
-          <w:sz w:val="22"/>
-          <w:szCs w:val="22"/>
-        </w:rPr>
-        <w:t xml:space="preserve">Der erste Admin-Benutzer wird direkt über die API oder ein Initialisierungsskript erstellt (kein UI-Weg, da noch kein Admin existiert):</w:t>
+        <w:t xml:space="preserve">[ TECHNISCHER ABSCHNITT — erfordert Linux/GPG-Kenntnisse ]</w:t>
       </w:r>
     </w:p>
     <w:p>
@@ -1189,37 +1154,7 @@
           <w:sz w:val="20"/>
           <w:szCs w:val="20"/>
         </w:rPr>
-        <w:t xml:space="preserve">  --email admin@kirchgemeinde.ch \</w:t>
-      </w:r>
-    </w:p>
-    <w:p>
-      <w:pPr>
-        <w:shd w:fill="F0F0F0" w:val="clear"/>
-        <w:spacing w:after="40"/>
-        <w:ind w:left="480"/>
-      </w:pPr>
-      <w:r>
-        <w:rPr>
-          <w:rFonts w:ascii="Courier New" w:cs="Courier New" w:eastAsia="Courier New" w:hAnsi="Courier New"/>
-          <w:sz w:val="20"/>
-          <w:szCs w:val="20"/>
-        </w:rPr>
-        <w:t xml:space="preserve">  --name "Vorname Nachname" \</w:t>
-      </w:r>
-    </w:p>
-    <w:p>
-      <w:pPr>
-        <w:shd w:fill="F0F0F0" w:val="clear"/>
-        <w:spacing w:after="40"/>
-        <w:ind w:left="480"/>
-      </w:pPr>
-      <w:r>
-        <w:rPr>
-          <w:rFonts w:ascii="Courier New" w:cs="Courier New" w:eastAsia="Courier New" w:hAnsi="Courier New"/>
-          <w:sz w:val="20"/>
-          <w:szCs w:val="20"/>
-        </w:rPr>
-        <w:t xml:space="preserve">  --password "SicheresPasswort"</w:t>
+        <w:t xml:space="preserve">  --email admin@kirchgemeinde.ch --name "Vorname Name" --password "Passwort"</w:t>
       </w:r>
     </w:p>
     <w:p>
@@ -1329,7 +1264,6 @@
                 <w:rFonts w:ascii="Calibri" w:cs="Calibri" w:eastAsia="Calibri" w:hAnsi="Calibri"/>
                 <w:b/>
                 <w:bCs/>
-                <w:color w:val="000000"/>
                 <w:sz w:val="20"/>
                 <w:szCs w:val="20"/>
               </w:rPr>
@@ -1360,7 +1294,6 @@
                 <w:rFonts w:ascii="Calibri" w:cs="Calibri" w:eastAsia="Calibri" w:hAnsi="Calibri"/>
                 <w:b/>
                 <w:bCs/>
-                <w:color w:val="000000"/>
                 <w:sz w:val="20"/>
                 <w:szCs w:val="20"/>
               </w:rPr>
@@ -1391,7 +1324,6 @@
                 <w:rFonts w:ascii="Calibri" w:cs="Calibri" w:eastAsia="Calibri" w:hAnsi="Calibri"/>
                 <w:b/>
                 <w:bCs/>
-                <w:color w:val="000000"/>
                 <w:sz w:val="20"/>
                 <w:szCs w:val="20"/>
               </w:rPr>
@@ -1422,7 +1354,6 @@
                 <w:rFonts w:ascii="Calibri" w:cs="Calibri" w:eastAsia="Calibri" w:hAnsi="Calibri"/>
                 <w:b/>
                 <w:bCs/>
-                <w:color w:val="000000"/>
                 <w:sz w:val="20"/>
                 <w:szCs w:val="20"/>
               </w:rPr>
@@ -1455,7 +1386,6 @@
                 <w:rFonts w:ascii="Calibri" w:cs="Calibri" w:eastAsia="Calibri" w:hAnsi="Calibri"/>
                 <w:b w:val="false"/>
                 <w:bCs w:val="false"/>
-                <w:color w:val="000000"/>
                 <w:sz w:val="20"/>
                 <w:szCs w:val="20"/>
               </w:rPr>
@@ -1486,7 +1416,6 @@
                 <w:rFonts w:ascii="Calibri" w:cs="Calibri" w:eastAsia="Calibri" w:hAnsi="Calibri"/>
                 <w:b w:val="false"/>
                 <w:bCs w:val="false"/>
-                <w:color w:val="000000"/>
                 <w:sz w:val="20"/>
                 <w:szCs w:val="20"/>
               </w:rPr>
@@ -1517,7 +1446,6 @@
                 <w:rFonts w:ascii="Calibri" w:cs="Calibri" w:eastAsia="Calibri" w:hAnsi="Calibri"/>
                 <w:b w:val="false"/>
                 <w:bCs w:val="false"/>
-                <w:color w:val="000000"/>
                 <w:sz w:val="20"/>
                 <w:szCs w:val="20"/>
               </w:rPr>
@@ -1548,7 +1476,6 @@
                 <w:rFonts w:ascii="Calibri" w:cs="Calibri" w:eastAsia="Calibri" w:hAnsi="Calibri"/>
                 <w:b w:val="false"/>
                 <w:bCs w:val="false"/>
-                <w:color w:val="000000"/>
                 <w:sz w:val="20"/>
                 <w:szCs w:val="20"/>
               </w:rPr>
@@ -1581,7 +1508,6 @@
                 <w:rFonts w:ascii="Calibri" w:cs="Calibri" w:eastAsia="Calibri" w:hAnsi="Calibri"/>
                 <w:b w:val="false"/>
                 <w:bCs w:val="false"/>
-                <w:color w:val="000000"/>
                 <w:sz w:val="20"/>
                 <w:szCs w:val="20"/>
               </w:rPr>
@@ -1612,7 +1538,6 @@
                 <w:rFonts w:ascii="Calibri" w:cs="Calibri" w:eastAsia="Calibri" w:hAnsi="Calibri"/>
                 <w:b w:val="false"/>
                 <w:bCs w:val="false"/>
-                <w:color w:val="000000"/>
                 <w:sz w:val="20"/>
                 <w:szCs w:val="20"/>
               </w:rPr>
@@ -1643,7 +1568,6 @@
                 <w:rFonts w:ascii="Calibri" w:cs="Calibri" w:eastAsia="Calibri" w:hAnsi="Calibri"/>
                 <w:b w:val="false"/>
                 <w:bCs w:val="false"/>
-                <w:color w:val="000000"/>
                 <w:sz w:val="20"/>
                 <w:szCs w:val="20"/>
               </w:rPr>
@@ -1674,7 +1598,6 @@
                 <w:rFonts w:ascii="Calibri" w:cs="Calibri" w:eastAsia="Calibri" w:hAnsi="Calibri"/>
                 <w:b w:val="false"/>
                 <w:bCs w:val="false"/>
-                <w:color w:val="000000"/>
                 <w:sz w:val="20"/>
                 <w:szCs w:val="20"/>
               </w:rPr>
@@ -1707,7 +1630,6 @@
                 <w:rFonts w:ascii="Calibri" w:cs="Calibri" w:eastAsia="Calibri" w:hAnsi="Calibri"/>
                 <w:b w:val="false"/>
                 <w:bCs w:val="false"/>
-                <w:color w:val="000000"/>
                 <w:sz w:val="20"/>
                 <w:szCs w:val="20"/>
               </w:rPr>
@@ -1738,7 +1660,6 @@
                 <w:rFonts w:ascii="Calibri" w:cs="Calibri" w:eastAsia="Calibri" w:hAnsi="Calibri"/>
                 <w:b w:val="false"/>
                 <w:bCs w:val="false"/>
-                <w:color w:val="000000"/>
                 <w:sz w:val="20"/>
                 <w:szCs w:val="20"/>
               </w:rPr>
@@ -1769,7 +1690,6 @@
                 <w:rFonts w:ascii="Calibri" w:cs="Calibri" w:eastAsia="Calibri" w:hAnsi="Calibri"/>
                 <w:b w:val="false"/>
                 <w:bCs w:val="false"/>
-                <w:color w:val="000000"/>
                 <w:sz w:val="20"/>
                 <w:szCs w:val="20"/>
               </w:rPr>
@@ -1800,7 +1720,6 @@
                 <w:rFonts w:ascii="Calibri" w:cs="Calibri" w:eastAsia="Calibri" w:hAnsi="Calibri"/>
                 <w:b w:val="false"/>
                 <w:bCs w:val="false"/>
-                <w:color w:val="000000"/>
                 <w:sz w:val="20"/>
                 <w:szCs w:val="20"/>
               </w:rPr>
@@ -1835,7 +1754,7 @@
           <w:sz w:val="20"/>
           <w:szCs w:val="20"/>
         </w:rPr>
-        <w:t xml:space="preserve">ℹ Alle Backups sind AES-256 verschlüsselt. Infomaniak sieht nur verschlüsselte Daten.</w:t>
+        <w:t xml:space="preserve">ℹ Alle Backups sind AES-256 (GPG) verschlüsselt. Infomaniak sieht nur verschlüsselte Daten.</w:t>
       </w:r>
     </w:p>
     <w:p>
@@ -1876,7 +1795,7 @@
           <w:sz w:val="18"/>
           <w:szCs w:val="18"/>
         </w:rPr>
-        <w:t xml:space="preserve">[ TECHNISCHER ABSCHNITT — erfordert Linux/Docker-Kenntnisse ]</w:t>
+        <w:t xml:space="preserve">[ TECHNISCHER ABSCHNITT — erfordert Linux/GPG-Kenntnisse ]</w:t>
       </w:r>
     </w:p>
     <w:p>
@@ -1889,7 +1808,7 @@
           <w:sz w:val="22"/>
           <w:szCs w:val="22"/>
         </w:rPr>
-        <w:t xml:space="preserve">Der Backup-Job läuft als systemd-Timer auf dem VPS-Host (nicht im Container):</w:t>
+        <w:t xml:space="preserve">Systemd-Timer auf dem VPS-Host:</w:t>
       </w:r>
     </w:p>
     <w:p>
@@ -2003,36 +1922,6 @@
           <w:szCs w:val="20"/>
         </w:rPr>
         <w:t xml:space="preserve"># /etc/systemd/system/kirchenplanung-backup.timer</w:t>
-      </w:r>
-    </w:p>
-    <w:p>
-      <w:pPr>
-        <w:shd w:fill="F0F0F0" w:val="clear"/>
-        <w:spacing w:after="40"/>
-        <w:ind w:left="480"/>
-      </w:pPr>
-      <w:r>
-        <w:rPr>
-          <w:rFonts w:ascii="Courier New" w:cs="Courier New" w:eastAsia="Courier New" w:hAnsi="Courier New"/>
-          <w:sz w:val="20"/>
-          <w:szCs w:val="20"/>
-        </w:rPr>
-        <w:t xml:space="preserve">[Unit]</w:t>
-      </w:r>
-    </w:p>
-    <w:p>
-      <w:pPr>
-        <w:shd w:fill="F0F0F0" w:val="clear"/>
-        <w:spacing w:after="40"/>
-        <w:ind w:left="480"/>
-      </w:pPr>
-      <w:r>
-        <w:rPr>
-          <w:rFonts w:ascii="Courier New" w:cs="Courier New" w:eastAsia="Courier New" w:hAnsi="Courier New"/>
-          <w:sz w:val="20"/>
-          <w:szCs w:val="20"/>
-        </w:rPr>
-        <w:t xml:space="preserve">Description=Kirchenplanung Backup täglich</w:t>
       </w:r>
     </w:p>
     <w:p>
@@ -2171,7 +2060,7 @@
           <w:sz w:val="18"/>
           <w:szCs w:val="18"/>
         </w:rPr>
-        <w:t xml:space="preserve">[ TECHNISCHER ABSCHNITT — erfordert Linux/Docker-Kenntnisse ]</w:t>
+        <w:t xml:space="preserve">[ TECHNISCHER ABSCHNITT — erfordert Linux/GPG-Kenntnisse ]</w:t>
       </w:r>
     </w:p>
     <w:p>
@@ -2187,19 +2076,6 @@
           <w:szCs w:val="20"/>
         </w:rPr>
         <w:t xml:space="preserve">cd /opt/kirchenplanung &amp;&amp; ./scripts/backup.sh</w:t>
-      </w:r>
-    </w:p>
-    <w:p>
-      <w:pPr>
-        <w:spacing w:after="120"/>
-      </w:pPr>
-      <w:r>
-        <w:rPr>
-          <w:rFonts w:ascii="Calibri" w:cs="Calibri" w:eastAsia="Calibri" w:hAnsi="Calibri"/>
-          <w:sz w:val="22"/>
-          <w:szCs w:val="22"/>
-        </w:rPr>
-        <w:t xml:space="preserve">Das Skript gibt den Fortschritt aus und meldet Erfolg oder Fehler.</w:t>
       </w:r>
     </w:p>
     <w:p>
@@ -2240,20 +2116,7 @@
           <w:sz w:val="18"/>
           <w:szCs w:val="18"/>
         </w:rPr>
-        <w:t xml:space="preserve">[ TECHNISCHER ABSCHNITT — erfordert Linux/Docker-Kenntnisse ]</w:t>
-      </w:r>
-    </w:p>
-    <w:p>
-      <w:pPr>
-        <w:spacing w:after="120"/>
-      </w:pPr>
-      <w:r>
-        <w:rPr>
-          <w:rFonts w:ascii="Calibri" w:cs="Calibri" w:eastAsia="Calibri" w:hAnsi="Calibri"/>
-          <w:sz w:val="22"/>
-          <w:szCs w:val="22"/>
-        </w:rPr>
-        <w:t xml:space="preserve">Regelmässig (empfohlen: monatlich) prüfen ob Backups vorhanden und lesbar sind:</w:t>
+        <w:t xml:space="preserve">[ TECHNISCHER ABSCHNITT — erfordert Linux/GPG-Kenntnisse ]</w:t>
       </w:r>
     </w:p>
     <w:p>
@@ -2269,21 +2132,6 @@
           <w:szCs w:val="20"/>
         </w:rPr>
         <w:t xml:space="preserve">ls -lh /var/backups/kirchenplanung/</w:t>
-      </w:r>
-    </w:p>
-    <w:p>
-      <w:pPr>
-        <w:shd w:fill="F0F0F0" w:val="clear"/>
-        <w:spacing w:after="40"/>
-        <w:ind w:left="480"/>
-      </w:pPr>
-      <w:r>
-        <w:rPr>
-          <w:rFonts w:ascii="Courier New" w:cs="Courier New" w:eastAsia="Courier New" w:hAnsi="Courier New"/>
-          <w:sz w:val="20"/>
-          <w:szCs w:val="20"/>
-        </w:rPr>
-        <w:t xml:space="preserve"># Letztes Backup entschlüsseln und Inhalt prüfen:</w:t>
       </w:r>
     </w:p>
     <w:p>
@@ -2339,7 +2187,7 @@
           <w:sz w:val="18"/>
           <w:szCs w:val="18"/>
         </w:rPr>
-        <w:t xml:space="preserve">[ TECHNISCHER ABSCHNITT — erfordert Linux/Docker-Kenntnisse ]</w:t>
+        <w:t xml:space="preserve">[ TECHNISCHER ABSCHNITT — erfordert Linux/GPG-Kenntnisse ]</w:t>
       </w:r>
     </w:p>
     <w:p>
@@ -2359,7 +2207,7 @@
           <w:sz w:val="20"/>
           <w:szCs w:val="20"/>
         </w:rPr>
-        <w:t xml:space="preserve">⚠ Wiederherstellung überschreibt alle aktuellen Daten. Zuerst ein frisches Backup erstellen wenn möglich.</w:t>
+        <w:t xml:space="preserve">⚠ Wiederherstellung überschreibt alle aktuellen Daten. Vorher wenn möglich ein frisches Backup erstellen.</w:t>
       </w:r>
     </w:p>
     <w:p>
@@ -2440,7 +2288,7 @@
           <w:sz w:val="22"/>
           <w:szCs w:val="22"/>
         </w:rPr>
-        <w:t xml:space="preserve">Datenbank-Volume leeren und neu erstellen:</w:t>
+        <w:t xml:space="preserve">Volume leeren:</w:t>
       </w:r>
     </w:p>
     <w:p>
@@ -2472,7 +2320,7 @@
           <w:sz w:val="22"/>
           <w:szCs w:val="22"/>
         </w:rPr>
-        <w:t xml:space="preserve">Container starten (PostgreSQL initialisiert sich neu):</w:t>
+        <w:t xml:space="preserve">DB starten:</w:t>
       </w:r>
     </w:p>
     <w:p>
@@ -2579,6 +2427,1185 @@
     </w:p>
     <w:p>
       <w:pPr>
+        <w:pStyle w:val="Heading2"/>
+        <w:spacing w:after="80" w:before="240"/>
+      </w:pPr>
+      <w:r>
+        <w:rPr>
+          <w:rFonts w:ascii="Calibri" w:cs="Calibri" w:eastAsia="Calibri" w:hAnsi="Calibri"/>
+          <w:b/>
+          <w:bCs/>
+          <w:color w:val="3A6B8A"/>
+          <w:sz w:val="24"/>
+          <w:szCs w:val="24"/>
+        </w:rPr>
+        <w:t xml:space="preserve">3.6 GPG-Schlüssel-Management</w:t>
+      </w:r>
+    </w:p>
+    <w:p>
+      <w:pPr>
+        <w:spacing w:after="80" w:before="80"/>
+      </w:pPr>
+      <w:r>
+        <w:rPr>
+          <w:rFonts w:ascii="Calibri" w:cs="Calibri" w:eastAsia="Calibri" w:hAnsi="Calibri"/>
+          <w:i/>
+          <w:iCs/>
+          <w:color w:val="666666"/>
+          <w:sz w:val="18"/>
+          <w:szCs w:val="18"/>
+        </w:rPr>
+        <w:t xml:space="preserve">[ TECHNISCHER ABSCHNITT — erfordert Linux/GPG-Kenntnisse ]</w:t>
+      </w:r>
+    </w:p>
+    <w:p>
+      <w:pPr>
+        <w:pBdr>
+          <w:left w:val="single" w:color="C0392B" w:sz="10" w:space="8"/>
+        </w:pBdr>
+        <w:spacing w:after="120" w:before="60"/>
+        <w:ind w:left="360"/>
+      </w:pPr>
+      <w:r>
+        <w:rPr>
+          <w:rFonts w:ascii="Calibri" w:cs="Calibri" w:eastAsia="Calibri" w:hAnsi="Calibri"/>
+          <w:b/>
+          <w:bCs/>
+          <w:color w:val="6E2C00"/>
+          <w:sz w:val="20"/>
+          <w:szCs w:val="20"/>
+        </w:rPr>
+        <w:t xml:space="preserve">🔑 Der GPG-Private-Key ist der einzige Weg, Backups zu entschlüsseln. Geht er verloren, sind alle Backups unbrauchbar. Diesen Abschnitt sorgfältig lesen und umsetzen.</w:t>
+      </w:r>
+    </w:p>
+    <w:p>
+      <w:pPr>
+        <w:spacing w:after="80"/>
+      </w:pPr>
+      <w:r>
+        <w:t xml:space="preserve"/>
+      </w:r>
+    </w:p>
+    <w:p>
+      <w:pPr>
+        <w:pStyle w:val="Heading3"/>
+        <w:spacing w:after="60" w:before="160"/>
+      </w:pPr>
+      <w:r>
+        <w:rPr>
+          <w:rFonts w:ascii="Calibri" w:cs="Calibri" w:eastAsia="Calibri" w:hAnsi="Calibri"/>
+          <w:b/>
+          <w:bCs/>
+          <w:color w:val="2E4057"/>
+          <w:sz w:val="22"/>
+          <w:szCs w:val="22"/>
+        </w:rPr>
+        <w:t xml:space="preserve">Konzept</w:t>
+      </w:r>
+    </w:p>
+    <w:p>
+      <w:pPr>
+        <w:spacing w:after="120"/>
+      </w:pPr>
+      <w:r>
+        <w:rPr>
+          <w:rFonts w:ascii="Calibri" w:cs="Calibri" w:eastAsia="Calibri" w:hAnsi="Calibri"/>
+          <w:sz w:val="22"/>
+          <w:szCs w:val="22"/>
+        </w:rPr>
+        <w:t xml:space="preserve">GPG arbeitet mit einem Schlüsselpaar: Der Public Key verschlüsselt die Backups auf dem VPS. Der Private Key entschlüsselt sie — er verlässt den lokalen Rechner nie und wird niemals auf dem VPS gespeichert.</w:t>
+      </w:r>
+    </w:p>
+    <w:tbl>
+      <w:tblPr>
+        <w:tblW w:type="dxa" w:w="9026"/>
+        <w:tblBorders>
+          <w:top w:val="single" w:color="auto" w:sz="4"/>
+          <w:left w:val="single" w:color="auto" w:sz="4"/>
+          <w:bottom w:val="single" w:color="auto" w:sz="4"/>
+          <w:right w:val="single" w:color="auto" w:sz="4"/>
+          <w:insideH w:val="single" w:color="auto" w:sz="4"/>
+          <w:insideV w:val="single" w:color="auto" w:sz="4"/>
+        </w:tblBorders>
+      </w:tblPr>
+      <w:tblGrid>
+        <w:gridCol w:w="2000"/>
+        <w:gridCol w:w="3200"/>
+        <w:gridCol w:w="3826"/>
+      </w:tblGrid>
+      <w:tr>
+        <w:tc>
+          <w:tcPr>
+            <w:tcW w:type="dxa" w:w="2000"/>
+            <w:tcBorders>
+              <w:top w:val="single" w:color="BBCCDD" w:sz="1"/>
+              <w:left w:val="single" w:color="BBCCDD" w:sz="1"/>
+              <w:bottom w:val="single" w:color="BBCCDD" w:sz="1"/>
+              <w:right w:val="single" w:color="BBCCDD" w:sz="1"/>
+            </w:tcBorders>
+            <w:shd w:fill="DDE8F0" w:val="clear"/>
+            <w:tcMar>
+              <w:top w:type="dxa" w:w="80"/>
+              <w:left w:type="dxa" w:w="120"/>
+              <w:bottom w:type="dxa" w:w="80"/>
+              <w:right w:type="dxa" w:w="120"/>
+            </w:tcMar>
+          </w:tcPr>
+          <w:p>
+            <w:r>
+              <w:rPr>
+                <w:rFonts w:ascii="Calibri" w:cs="Calibri" w:eastAsia="Calibri" w:hAnsi="Calibri"/>
+                <w:b/>
+                <w:bCs/>
+                <w:sz w:val="20"/>
+                <w:szCs w:val="20"/>
+              </w:rPr>
+              <w:t xml:space="preserve">Schlüssel</w:t>
+            </w:r>
+          </w:p>
+        </w:tc>
+        <w:tc>
+          <w:tcPr>
+            <w:tcW w:type="dxa" w:w="3200"/>
+            <w:tcBorders>
+              <w:top w:val="single" w:color="BBCCDD" w:sz="1"/>
+              <w:left w:val="single" w:color="BBCCDD" w:sz="1"/>
+              <w:bottom w:val="single" w:color="BBCCDD" w:sz="1"/>
+              <w:right w:val="single" w:color="BBCCDD" w:sz="1"/>
+            </w:tcBorders>
+            <w:shd w:fill="DDE8F0" w:val="clear"/>
+            <w:tcMar>
+              <w:top w:type="dxa" w:w="80"/>
+              <w:left w:type="dxa" w:w="120"/>
+              <w:bottom w:type="dxa" w:w="80"/>
+              <w:right w:type="dxa" w:w="120"/>
+            </w:tcMar>
+          </w:tcPr>
+          <w:p>
+            <w:r>
+              <w:rPr>
+                <w:rFonts w:ascii="Calibri" w:cs="Calibri" w:eastAsia="Calibri" w:hAnsi="Calibri"/>
+                <w:b/>
+                <w:bCs/>
+                <w:sz w:val="20"/>
+                <w:szCs w:val="20"/>
+              </w:rPr>
+              <w:t xml:space="preserve">Wo</w:t>
+            </w:r>
+          </w:p>
+        </w:tc>
+        <w:tc>
+          <w:tcPr>
+            <w:tcW w:type="dxa" w:w="3826"/>
+            <w:tcBorders>
+              <w:top w:val="single" w:color="BBCCDD" w:sz="1"/>
+              <w:left w:val="single" w:color="BBCCDD" w:sz="1"/>
+              <w:bottom w:val="single" w:color="BBCCDD" w:sz="1"/>
+              <w:right w:val="single" w:color="BBCCDD" w:sz="1"/>
+            </w:tcBorders>
+            <w:shd w:fill="DDE8F0" w:val="clear"/>
+            <w:tcMar>
+              <w:top w:type="dxa" w:w="80"/>
+              <w:left w:type="dxa" w:w="120"/>
+              <w:bottom w:type="dxa" w:w="80"/>
+              <w:right w:type="dxa" w:w="120"/>
+            </w:tcMar>
+          </w:tcPr>
+          <w:p>
+            <w:r>
+              <w:rPr>
+                <w:rFonts w:ascii="Calibri" w:cs="Calibri" w:eastAsia="Calibri" w:hAnsi="Calibri"/>
+                <w:b/>
+                <w:bCs/>
+                <w:sz w:val="20"/>
+                <w:szCs w:val="20"/>
+              </w:rPr>
+              <w:t xml:space="preserve">Zweck</w:t>
+            </w:r>
+          </w:p>
+        </w:tc>
+      </w:tr>
+      <w:tr>
+        <w:tc>
+          <w:tcPr>
+            <w:tcW w:type="dxa" w:w="2000"/>
+            <w:tcBorders>
+              <w:top w:val="single" w:color="BBCCDD" w:sz="1"/>
+              <w:left w:val="single" w:color="BBCCDD" w:sz="1"/>
+              <w:bottom w:val="single" w:color="BBCCDD" w:sz="1"/>
+              <w:right w:val="single" w:color="BBCCDD" w:sz="1"/>
+            </w:tcBorders>
+            <w:shd w:fill="FFFFFF" w:val="clear"/>
+            <w:tcMar>
+              <w:top w:type="dxa" w:w="80"/>
+              <w:left w:type="dxa" w:w="120"/>
+              <w:bottom w:type="dxa" w:w="80"/>
+              <w:right w:type="dxa" w:w="120"/>
+            </w:tcMar>
+          </w:tcPr>
+          <w:p>
+            <w:r>
+              <w:rPr>
+                <w:rFonts w:ascii="Calibri" w:cs="Calibri" w:eastAsia="Calibri" w:hAnsi="Calibri"/>
+                <w:b w:val="false"/>
+                <w:bCs w:val="false"/>
+                <w:sz w:val="20"/>
+                <w:szCs w:val="20"/>
+              </w:rPr>
+              <w:t xml:space="preserve">Public Key</w:t>
+            </w:r>
+          </w:p>
+        </w:tc>
+        <w:tc>
+          <w:tcPr>
+            <w:tcW w:type="dxa" w:w="3200"/>
+            <w:tcBorders>
+              <w:top w:val="single" w:color="BBCCDD" w:sz="1"/>
+              <w:left w:val="single" w:color="BBCCDD" w:sz="1"/>
+              <w:bottom w:val="single" w:color="BBCCDD" w:sz="1"/>
+              <w:right w:val="single" w:color="BBCCDD" w:sz="1"/>
+            </w:tcBorders>
+            <w:shd w:fill="FFFFFF" w:val="clear"/>
+            <w:tcMar>
+              <w:top w:type="dxa" w:w="80"/>
+              <w:left w:type="dxa" w:w="120"/>
+              <w:bottom w:type="dxa" w:w="80"/>
+              <w:right w:type="dxa" w:w="120"/>
+            </w:tcMar>
+          </w:tcPr>
+          <w:p>
+            <w:r>
+              <w:rPr>
+                <w:rFonts w:ascii="Calibri" w:cs="Calibri" w:eastAsia="Calibri" w:hAnsi="Calibri"/>
+                <w:b w:val="false"/>
+                <w:bCs w:val="false"/>
+                <w:sz w:val="20"/>
+                <w:szCs w:val="20"/>
+              </w:rPr>
+              <w:t xml:space="preserve">VPS + Repo (docs/)</w:t>
+            </w:r>
+          </w:p>
+        </w:tc>
+        <w:tc>
+          <w:tcPr>
+            <w:tcW w:type="dxa" w:w="3826"/>
+            <w:tcBorders>
+              <w:top w:val="single" w:color="BBCCDD" w:sz="1"/>
+              <w:left w:val="single" w:color="BBCCDD" w:sz="1"/>
+              <w:bottom w:val="single" w:color="BBCCDD" w:sz="1"/>
+              <w:right w:val="single" w:color="BBCCDD" w:sz="1"/>
+            </w:tcBorders>
+            <w:shd w:fill="FFFFFF" w:val="clear"/>
+            <w:tcMar>
+              <w:top w:type="dxa" w:w="80"/>
+              <w:left w:type="dxa" w:w="120"/>
+              <w:bottom w:type="dxa" w:w="80"/>
+              <w:right w:type="dxa" w:w="120"/>
+            </w:tcMar>
+          </w:tcPr>
+          <w:p>
+            <w:r>
+              <w:rPr>
+                <w:rFonts w:ascii="Calibri" w:cs="Calibri" w:eastAsia="Calibri" w:hAnsi="Calibri"/>
+                <w:b w:val="false"/>
+                <w:bCs w:val="false"/>
+                <w:sz w:val="20"/>
+                <w:szCs w:val="20"/>
+              </w:rPr>
+              <w:t xml:space="preserve">Backups verschlüsseln — kann öffentlich sein</w:t>
+            </w:r>
+          </w:p>
+        </w:tc>
+      </w:tr>
+      <w:tr>
+        <w:tc>
+          <w:tcPr>
+            <w:tcW w:type="dxa" w:w="2000"/>
+            <w:tcBorders>
+              <w:top w:val="single" w:color="BBCCDD" w:sz="1"/>
+              <w:left w:val="single" w:color="BBCCDD" w:sz="1"/>
+              <w:bottom w:val="single" w:color="BBCCDD" w:sz="1"/>
+              <w:right w:val="single" w:color="BBCCDD" w:sz="1"/>
+            </w:tcBorders>
+            <w:shd w:fill="F5F8FB" w:val="clear"/>
+            <w:tcMar>
+              <w:top w:type="dxa" w:w="80"/>
+              <w:left w:type="dxa" w:w="120"/>
+              <w:bottom w:type="dxa" w:w="80"/>
+              <w:right w:type="dxa" w:w="120"/>
+            </w:tcMar>
+          </w:tcPr>
+          <w:p>
+            <w:r>
+              <w:rPr>
+                <w:rFonts w:ascii="Calibri" w:cs="Calibri" w:eastAsia="Calibri" w:hAnsi="Calibri"/>
+                <w:b w:val="false"/>
+                <w:bCs w:val="false"/>
+                <w:sz w:val="20"/>
+                <w:szCs w:val="20"/>
+              </w:rPr>
+              <w:t xml:space="preserve">Private Key</w:t>
+            </w:r>
+          </w:p>
+        </w:tc>
+        <w:tc>
+          <w:tcPr>
+            <w:tcW w:type="dxa" w:w="3200"/>
+            <w:tcBorders>
+              <w:top w:val="single" w:color="BBCCDD" w:sz="1"/>
+              <w:left w:val="single" w:color="BBCCDD" w:sz="1"/>
+              <w:bottom w:val="single" w:color="BBCCDD" w:sz="1"/>
+              <w:right w:val="single" w:color="BBCCDD" w:sz="1"/>
+            </w:tcBorders>
+            <w:shd w:fill="F5F8FB" w:val="clear"/>
+            <w:tcMar>
+              <w:top w:type="dxa" w:w="80"/>
+              <w:left w:type="dxa" w:w="120"/>
+              <w:bottom w:type="dxa" w:w="80"/>
+              <w:right w:type="dxa" w:w="120"/>
+            </w:tcMar>
+          </w:tcPr>
+          <w:p>
+            <w:r>
+              <w:rPr>
+                <w:rFonts w:ascii="Calibri" w:cs="Calibri" w:eastAsia="Calibri" w:hAnsi="Calibri"/>
+                <w:b w:val="false"/>
+                <w:bCs w:val="false"/>
+                <w:sz w:val="20"/>
+                <w:szCs w:val="20"/>
+              </w:rPr>
+              <w:t xml:space="preserve">Nur lokal (+ sicheres Offline-Backup)</w:t>
+            </w:r>
+          </w:p>
+        </w:tc>
+        <w:tc>
+          <w:tcPr>
+            <w:tcW w:type="dxa" w:w="3826"/>
+            <w:tcBorders>
+              <w:top w:val="single" w:color="BBCCDD" w:sz="1"/>
+              <w:left w:val="single" w:color="BBCCDD" w:sz="1"/>
+              <w:bottom w:val="single" w:color="BBCCDD" w:sz="1"/>
+              <w:right w:val="single" w:color="BBCCDD" w:sz="1"/>
+            </w:tcBorders>
+            <w:shd w:fill="F5F8FB" w:val="clear"/>
+            <w:tcMar>
+              <w:top w:type="dxa" w:w="80"/>
+              <w:left w:type="dxa" w:w="120"/>
+              <w:bottom w:type="dxa" w:w="80"/>
+              <w:right w:type="dxa" w:w="120"/>
+            </w:tcMar>
+          </w:tcPr>
+          <w:p>
+            <w:r>
+              <w:rPr>
+                <w:rFonts w:ascii="Calibri" w:cs="Calibri" w:eastAsia="Calibri" w:hAnsi="Calibri"/>
+                <w:b w:val="false"/>
+                <w:bCs w:val="false"/>
+                <w:sz w:val="20"/>
+                <w:szCs w:val="20"/>
+              </w:rPr>
+              <w:t xml:space="preserve">Backups entschlüsseln — streng geheim</w:t>
+            </w:r>
+          </w:p>
+        </w:tc>
+      </w:tr>
+    </w:tbl>
+    <w:p>
+      <w:pPr>
+        <w:spacing w:after="80"/>
+      </w:pPr>
+      <w:r>
+        <w:t xml:space="preserve"/>
+      </w:r>
+    </w:p>
+    <w:p>
+      <w:pPr>
+        <w:pStyle w:val="Heading3"/>
+        <w:spacing w:after="60" w:before="160"/>
+      </w:pPr>
+      <w:r>
+        <w:rPr>
+          <w:rFonts w:ascii="Calibri" w:cs="Calibri" w:eastAsia="Calibri" w:hAnsi="Calibri"/>
+          <w:b/>
+          <w:bCs/>
+          <w:color w:val="2E4057"/>
+          <w:sz w:val="22"/>
+          <w:szCs w:val="22"/>
+        </w:rPr>
+        <w:t xml:space="preserve">Einmalig: Schlüsselpaar erstellen (lokal, nicht auf dem VPS)</w:t>
+      </w:r>
+    </w:p>
+    <w:p>
+      <w:pPr>
+        <w:pBdr>
+          <w:left w:val="single" w:color="E59866" w:sz="6" w:space="8"/>
+        </w:pBdr>
+        <w:spacing w:after="120" w:before="60"/>
+        <w:ind w:left="360"/>
+      </w:pPr>
+      <w:r>
+        <w:rPr>
+          <w:rFonts w:ascii="Calibri" w:cs="Calibri" w:eastAsia="Calibri" w:hAnsi="Calibri"/>
+          <w:i/>
+          <w:iCs/>
+          <w:color w:val="8B4000"/>
+          <w:sz w:val="20"/>
+          <w:szCs w:val="20"/>
+        </w:rPr>
+        <w:t xml:space="preserve">⚠ Diesen Schritt auf dem eigenen Rechner ausführen, nicht auf dem VPS.</w:t>
+      </w:r>
+    </w:p>
+    <w:p>
+      <w:pPr>
+        <w:pStyle w:val="ListParagraph"/>
+        <w:numPr>
+          <w:ilvl w:val="0"/>
+          <w:numId w:val="3"/>
+        </w:numPr>
+      </w:pPr>
+      <w:r>
+        <w:rPr>
+          <w:rFonts w:ascii="Calibri" w:cs="Calibri" w:eastAsia="Calibri" w:hAnsi="Calibri"/>
+          <w:sz w:val="22"/>
+          <w:szCs w:val="22"/>
+        </w:rPr>
+        <w:t xml:space="preserve">Schlüsselpaar generieren:</w:t>
+      </w:r>
+    </w:p>
+    <w:p>
+      <w:pPr>
+        <w:shd w:fill="F0F0F0" w:val="clear"/>
+        <w:spacing w:after="40"/>
+        <w:ind w:left="480"/>
+      </w:pPr>
+      <w:r>
+        <w:rPr>
+          <w:rFonts w:ascii="Courier New" w:cs="Courier New" w:eastAsia="Courier New" w:hAnsi="Courier New"/>
+          <w:sz w:val="20"/>
+          <w:szCs w:val="20"/>
+        </w:rPr>
+        <w:t xml:space="preserve">gpg --full-generate-key</w:t>
+      </w:r>
+    </w:p>
+    <w:p>
+      <w:pPr>
+        <w:spacing w:after="120"/>
+      </w:pPr>
+      <w:r>
+        <w:rPr>
+          <w:rFonts w:ascii="Calibri" w:cs="Calibri" w:eastAsia="Calibri" w:hAnsi="Calibri"/>
+          <w:sz w:val="22"/>
+          <w:szCs w:val="22"/>
+        </w:rPr>
+        <w:t xml:space="preserve">Empfohlene Einstellungen: RSA und RSA, 4096 Bit, kein Ablaufdatum (oder 5 Jahre), Name und E-Mail der Kirchgemeinde, starke Passphrase.</w:t>
+      </w:r>
+    </w:p>
+    <w:p>
+      <w:pPr>
+        <w:pStyle w:val="ListParagraph"/>
+        <w:numPr>
+          <w:ilvl w:val="0"/>
+          <w:numId w:val="3"/>
+        </w:numPr>
+      </w:pPr>
+      <w:r>
+        <w:rPr>
+          <w:rFonts w:ascii="Calibri" w:cs="Calibri" w:eastAsia="Calibri" w:hAnsi="Calibri"/>
+          <w:sz w:val="22"/>
+          <w:szCs w:val="22"/>
+        </w:rPr>
+        <w:t xml:space="preserve">Key-ID notieren:</w:t>
+      </w:r>
+    </w:p>
+    <w:p>
+      <w:pPr>
+        <w:shd w:fill="F0F0F0" w:val="clear"/>
+        <w:spacing w:after="40"/>
+        <w:ind w:left="480"/>
+      </w:pPr>
+      <w:r>
+        <w:rPr>
+          <w:rFonts w:ascii="Courier New" w:cs="Courier New" w:eastAsia="Courier New" w:hAnsi="Courier New"/>
+          <w:sz w:val="20"/>
+          <w:szCs w:val="20"/>
+        </w:rPr>
+        <w:t xml:space="preserve">gpg --list-keys --keyid-format LONG</w:t>
+      </w:r>
+    </w:p>
+    <w:p>
+      <w:pPr>
+        <w:spacing w:after="120"/>
+      </w:pPr>
+      <w:r>
+        <w:rPr>
+          <w:rFonts w:ascii="Calibri" w:cs="Calibri" w:eastAsia="Calibri" w:hAnsi="Calibri"/>
+          <w:sz w:val="22"/>
+          <w:szCs w:val="22"/>
+        </w:rPr>
+        <w:t xml:space="preserve">Die Key-ID ist der lange Hex-String nach "rsa4096/" — z.B. ABCD1234EF567890. Diese ID in die .env-Datei als GPG_KEY_ID eintragen.</w:t>
+      </w:r>
+    </w:p>
+    <w:p>
+      <w:pPr>
+        <w:pStyle w:val="ListParagraph"/>
+        <w:numPr>
+          <w:ilvl w:val="0"/>
+          <w:numId w:val="3"/>
+        </w:numPr>
+      </w:pPr>
+      <w:r>
+        <w:rPr>
+          <w:rFonts w:ascii="Calibri" w:cs="Calibri" w:eastAsia="Calibri" w:hAnsi="Calibri"/>
+          <w:sz w:val="22"/>
+          <w:szCs w:val="22"/>
+        </w:rPr>
+        <w:t xml:space="preserve">Public Key exportieren:</w:t>
+      </w:r>
+    </w:p>
+    <w:p>
+      <w:pPr>
+        <w:shd w:fill="F0F0F0" w:val="clear"/>
+        <w:spacing w:after="40"/>
+        <w:ind w:left="480"/>
+      </w:pPr>
+      <w:r>
+        <w:rPr>
+          <w:rFonts w:ascii="Courier New" w:cs="Courier New" w:eastAsia="Courier New" w:hAnsi="Courier New"/>
+          <w:sz w:val="20"/>
+          <w:szCs w:val="20"/>
+        </w:rPr>
+        <w:t xml:space="preserve">gpg --armor --export ABCD1234EF567890 &gt; kirchenplanung-backup.pub.asc</w:t>
+      </w:r>
+    </w:p>
+    <w:p>
+      <w:pPr>
+        <w:spacing w:after="80"/>
+      </w:pPr>
+      <w:r>
+        <w:t xml:space="preserve"/>
+      </w:r>
+    </w:p>
+    <w:p>
+      <w:pPr>
+        <w:pStyle w:val="Heading3"/>
+        <w:spacing w:after="60" w:before="160"/>
+      </w:pPr>
+      <w:r>
+        <w:rPr>
+          <w:rFonts w:ascii="Calibri" w:cs="Calibri" w:eastAsia="Calibri" w:hAnsi="Calibri"/>
+          <w:b/>
+          <w:bCs/>
+          <w:color w:val="2E4057"/>
+          <w:sz w:val="22"/>
+          <w:szCs w:val="22"/>
+        </w:rPr>
+        <w:t xml:space="preserve">Public Key auf den VPS deployen</w:t>
+      </w:r>
+    </w:p>
+    <w:p>
+      <w:pPr>
+        <w:pStyle w:val="ListParagraph"/>
+        <w:numPr>
+          <w:ilvl w:val="0"/>
+          <w:numId w:val="3"/>
+        </w:numPr>
+      </w:pPr>
+      <w:r>
+        <w:rPr>
+          <w:rFonts w:ascii="Calibri" w:cs="Calibri" w:eastAsia="Calibri" w:hAnsi="Calibri"/>
+          <w:sz w:val="22"/>
+          <w:szCs w:val="22"/>
+        </w:rPr>
+        <w:t xml:space="preserve">Public Key auf den VPS kopieren:</w:t>
+      </w:r>
+    </w:p>
+    <w:p>
+      <w:pPr>
+        <w:shd w:fill="F0F0F0" w:val="clear"/>
+        <w:spacing w:after="40"/>
+        <w:ind w:left="480"/>
+      </w:pPr>
+      <w:r>
+        <w:rPr>
+          <w:rFonts w:ascii="Courier New" w:cs="Courier New" w:eastAsia="Courier New" w:hAnsi="Courier New"/>
+          <w:sz w:val="20"/>
+          <w:szCs w:val="20"/>
+        </w:rPr>
+        <w:t xml:space="preserve">scp kirchenplanung-backup.pub.asc user@vps:/tmp/</w:t>
+      </w:r>
+    </w:p>
+    <w:p>
+      <w:pPr>
+        <w:pStyle w:val="ListParagraph"/>
+        <w:numPr>
+          <w:ilvl w:val="0"/>
+          <w:numId w:val="3"/>
+        </w:numPr>
+      </w:pPr>
+      <w:r>
+        <w:rPr>
+          <w:rFonts w:ascii="Calibri" w:cs="Calibri" w:eastAsia="Calibri" w:hAnsi="Calibri"/>
+          <w:sz w:val="22"/>
+          <w:szCs w:val="22"/>
+        </w:rPr>
+        <w:t xml:space="preserve">Auf dem VPS importieren:</w:t>
+      </w:r>
+    </w:p>
+    <w:p>
+      <w:pPr>
+        <w:shd w:fill="F0F0F0" w:val="clear"/>
+        <w:spacing w:after="40"/>
+        <w:ind w:left="480"/>
+      </w:pPr>
+      <w:r>
+        <w:rPr>
+          <w:rFonts w:ascii="Courier New" w:cs="Courier New" w:eastAsia="Courier New" w:hAnsi="Courier New"/>
+          <w:sz w:val="20"/>
+          <w:szCs w:val="20"/>
+        </w:rPr>
+        <w:t xml:space="preserve">gpg --import /tmp/kirchenplanung-backup.pub.asc</w:t>
+      </w:r>
+    </w:p>
+    <w:p>
+      <w:pPr>
+        <w:shd w:fill="F0F0F0" w:val="clear"/>
+        <w:spacing w:after="40"/>
+        <w:ind w:left="480"/>
+      </w:pPr>
+      <w:r>
+        <w:rPr>
+          <w:rFonts w:ascii="Courier New" w:cs="Courier New" w:eastAsia="Courier New" w:hAnsi="Courier New"/>
+          <w:sz w:val="20"/>
+          <w:szCs w:val="20"/>
+        </w:rPr>
+        <w:t xml:space="preserve">rm /tmp/kirchenplanung-backup.pub.asc</w:t>
+      </w:r>
+    </w:p>
+    <w:p>
+      <w:pPr>
+        <w:pStyle w:val="ListParagraph"/>
+        <w:numPr>
+          <w:ilvl w:val="0"/>
+          <w:numId w:val="3"/>
+        </w:numPr>
+      </w:pPr>
+      <w:r>
+        <w:rPr>
+          <w:rFonts w:ascii="Calibri" w:cs="Calibri" w:eastAsia="Calibri" w:hAnsi="Calibri"/>
+          <w:sz w:val="22"/>
+          <w:szCs w:val="22"/>
+        </w:rPr>
+        <w:t xml:space="preserve">Vertrauen setzen (damit GPG ohne Interaktion verschlüsseln kann):</w:t>
+      </w:r>
+    </w:p>
+    <w:p>
+      <w:pPr>
+        <w:shd w:fill="F0F0F0" w:val="clear"/>
+        <w:spacing w:after="40"/>
+        <w:ind w:left="480"/>
+      </w:pPr>
+      <w:r>
+        <w:rPr>
+          <w:rFonts w:ascii="Courier New" w:cs="Courier New" w:eastAsia="Courier New" w:hAnsi="Courier New"/>
+          <w:sz w:val="20"/>
+          <w:szCs w:val="20"/>
+        </w:rPr>
+        <w:t xml:space="preserve">gpg --edit-key ABCD1234EF567890</w:t>
+      </w:r>
+    </w:p>
+    <w:p>
+      <w:pPr>
+        <w:shd w:fill="F0F0F0" w:val="clear"/>
+        <w:spacing w:after="40"/>
+        <w:ind w:left="480"/>
+      </w:pPr>
+      <w:r>
+        <w:rPr>
+          <w:rFonts w:ascii="Courier New" w:cs="Courier New" w:eastAsia="Courier New" w:hAnsi="Courier New"/>
+          <w:sz w:val="20"/>
+          <w:szCs w:val="20"/>
+        </w:rPr>
+        <w:t xml:space="preserve">gpg&gt; trust</w:t>
+      </w:r>
+    </w:p>
+    <w:p>
+      <w:pPr>
+        <w:shd w:fill="F0F0F0" w:val="clear"/>
+        <w:spacing w:after="40"/>
+        <w:ind w:left="480"/>
+      </w:pPr>
+      <w:r>
+        <w:rPr>
+          <w:rFonts w:ascii="Courier New" w:cs="Courier New" w:eastAsia="Courier New" w:hAnsi="Courier New"/>
+          <w:sz w:val="20"/>
+          <w:szCs w:val="20"/>
+        </w:rPr>
+        <w:t xml:space="preserve">gpg&gt; 5   (ultimatives Vertrauen)</w:t>
+      </w:r>
+    </w:p>
+    <w:p>
+      <w:pPr>
+        <w:shd w:fill="F0F0F0" w:val="clear"/>
+        <w:spacing w:after="40"/>
+        <w:ind w:left="480"/>
+      </w:pPr>
+      <w:r>
+        <w:rPr>
+          <w:rFonts w:ascii="Courier New" w:cs="Courier New" w:eastAsia="Courier New" w:hAnsi="Courier New"/>
+          <w:sz w:val="20"/>
+          <w:szCs w:val="20"/>
+        </w:rPr>
+        <w:t xml:space="preserve">gpg&gt; quit</w:t>
+      </w:r>
+    </w:p>
+    <w:p>
+      <w:pPr>
+        <w:pBdr>
+          <w:left w:val="single" w:color="3A6B8A" w:sz="6" w:space="8"/>
+        </w:pBdr>
+        <w:spacing w:after="120" w:before="60"/>
+        <w:ind w:left="360"/>
+      </w:pPr>
+      <w:r>
+        <w:rPr>
+          <w:rFonts w:ascii="Calibri" w:cs="Calibri" w:eastAsia="Calibri" w:hAnsi="Calibri"/>
+          <w:i/>
+          <w:iCs/>
+          <w:color w:val="1A5276"/>
+          <w:sz w:val="20"/>
+          <w:szCs w:val="20"/>
+        </w:rPr>
+        <w:t xml:space="preserve">ℹ Den Public Key auch ins Repo unter docs/backup-pubkey.asc committen — er ist nicht geheim und erleichtert künftige Deployments.</w:t>
+      </w:r>
+    </w:p>
+    <w:p>
+      <w:pPr>
+        <w:spacing w:after="80"/>
+      </w:pPr>
+      <w:r>
+        <w:t xml:space="preserve"/>
+      </w:r>
+    </w:p>
+    <w:p>
+      <w:pPr>
+        <w:pStyle w:val="Heading3"/>
+        <w:spacing w:after="60" w:before="160"/>
+      </w:pPr>
+      <w:r>
+        <w:rPr>
+          <w:rFonts w:ascii="Calibri" w:cs="Calibri" w:eastAsia="Calibri" w:hAnsi="Calibri"/>
+          <w:b/>
+          <w:bCs/>
+          <w:color w:val="2E4057"/>
+          <w:sz w:val="22"/>
+          <w:szCs w:val="22"/>
+        </w:rPr>
+        <w:t xml:space="preserve">Private Key sicher aufbewahren</w:t>
+      </w:r>
+    </w:p>
+    <w:p>
+      <w:pPr>
+        <w:pBdr>
+          <w:left w:val="single" w:color="C0392B" w:sz="10" w:space="8"/>
+        </w:pBdr>
+        <w:spacing w:after="120" w:before="60"/>
+        <w:ind w:left="360"/>
+      </w:pPr>
+      <w:r>
+        <w:rPr>
+          <w:rFonts w:ascii="Calibri" w:cs="Calibri" w:eastAsia="Calibri" w:hAnsi="Calibri"/>
+          <w:b/>
+          <w:bCs/>
+          <w:color w:val="6E2C00"/>
+          <w:sz w:val="20"/>
+          <w:szCs w:val="20"/>
+        </w:rPr>
+        <w:t xml:space="preserve">🔑 Der Private Key muss an mindestens zwei physisch getrennten Orten aufbewahrt werden. Verlust = alle Backups unbrauchbar.</w:t>
+      </w:r>
+    </w:p>
+    <w:p>
+      <w:pPr>
+        <w:pStyle w:val="ListParagraph"/>
+        <w:numPr>
+          <w:ilvl w:val="0"/>
+          <w:numId w:val="3"/>
+        </w:numPr>
+      </w:pPr>
+      <w:r>
+        <w:rPr>
+          <w:rFonts w:ascii="Calibri" w:cs="Calibri" w:eastAsia="Calibri" w:hAnsi="Calibri"/>
+          <w:sz w:val="22"/>
+          <w:szCs w:val="22"/>
+        </w:rPr>
+        <w:t xml:space="preserve">Private Key exportieren (auf dem lokalen Rechner):</w:t>
+      </w:r>
+    </w:p>
+    <w:p>
+      <w:pPr>
+        <w:shd w:fill="F0F0F0" w:val="clear"/>
+        <w:spacing w:after="40"/>
+        <w:ind w:left="480"/>
+      </w:pPr>
+      <w:r>
+        <w:rPr>
+          <w:rFonts w:ascii="Courier New" w:cs="Courier New" w:eastAsia="Courier New" w:hAnsi="Courier New"/>
+          <w:sz w:val="20"/>
+          <w:szCs w:val="20"/>
+        </w:rPr>
+        <w:t xml:space="preserve">gpg --armor --export-secret-keys ABCD1234EF567890 &gt; kirchenplanung-backup.PRIVAT.asc</w:t>
+      </w:r>
+    </w:p>
+    <w:p>
+      <w:pPr>
+        <w:pBdr>
+          <w:left w:val="single" w:color="E59866" w:sz="6" w:space="8"/>
+        </w:pBdr>
+        <w:spacing w:after="120" w:before="60"/>
+        <w:ind w:left="360"/>
+      </w:pPr>
+      <w:r>
+        <w:rPr>
+          <w:rFonts w:ascii="Calibri" w:cs="Calibri" w:eastAsia="Calibri" w:hAnsi="Calibri"/>
+          <w:i/>
+          <w:iCs/>
+          <w:color w:val="8B4000"/>
+          <w:sz w:val="20"/>
+          <w:szCs w:val="20"/>
+        </w:rPr>
+        <w:t xml:space="preserve">⚠ Diese Datei enthält den privaten Schlüssel. Niemals per E-Mail verschicken, niemals ins Repo committen, niemals auf dem VPS speichern.</w:t>
+      </w:r>
+    </w:p>
+    <w:p>
+      <w:pPr>
+        <w:pStyle w:val="ListParagraph"/>
+        <w:numPr>
+          <w:ilvl w:val="0"/>
+          <w:numId w:val="3"/>
+        </w:numPr>
+      </w:pPr>
+      <w:r>
+        <w:rPr>
+          <w:rFonts w:ascii="Calibri" w:cs="Calibri" w:eastAsia="Calibri" w:hAnsi="Calibri"/>
+          <w:sz w:val="22"/>
+          <w:szCs w:val="22"/>
+        </w:rPr>
+        <w:t xml:space="preserve">Empfohlene Aufbewahrungsorte:</w:t>
+      </w:r>
+    </w:p>
+    <w:p>
+      <w:pPr>
+        <w:pStyle w:val="ListParagraph"/>
+        <w:numPr>
+          <w:ilvl w:val="1"/>
+          <w:numId w:val="2"/>
+        </w:numPr>
+      </w:pPr>
+      <w:r>
+        <w:rPr>
+          <w:rFonts w:ascii="Calibri" w:cs="Calibri" w:eastAsia="Calibri" w:hAnsi="Calibri"/>
+          <w:sz w:val="22"/>
+          <w:szCs w:val="22"/>
+        </w:rPr>
+        <w:t xml:space="preserve">Passwort-Manager (z.B. Bitwarden, KeePass) — als Dateianhang oder Secure Note</w:t>
+      </w:r>
+    </w:p>
+    <w:p>
+      <w:pPr>
+        <w:pStyle w:val="ListParagraph"/>
+        <w:numPr>
+          <w:ilvl w:val="1"/>
+          <w:numId w:val="2"/>
+        </w:numPr>
+      </w:pPr>
+      <w:r>
+        <w:rPr>
+          <w:rFonts w:ascii="Calibri" w:cs="Calibri" w:eastAsia="Calibri" w:hAnsi="Calibri"/>
+          <w:sz w:val="22"/>
+          <w:szCs w:val="22"/>
+        </w:rPr>
+        <w:t xml:space="preserve">Verschlüsselter USB-Stick an sicherem physischen Ort (z.B. Tresor der Kirchgemeinde)</w:t>
+      </w:r>
+    </w:p>
+    <w:p>
+      <w:pPr>
+        <w:pStyle w:val="ListParagraph"/>
+        <w:numPr>
+          <w:ilvl w:val="1"/>
+          <w:numId w:val="2"/>
+        </w:numPr>
+      </w:pPr>
+      <w:r>
+        <w:rPr>
+          <w:rFonts w:ascii="Calibri" w:cs="Calibri" w:eastAsia="Calibri" w:hAnsi="Calibri"/>
+          <w:sz w:val="22"/>
+          <w:szCs w:val="22"/>
+        </w:rPr>
+        <w:t xml:space="preserve">Ausgedruckt und versiegelt beim Pfarrer oder Kirchenpflege (Notfallzugang)</w:t>
+      </w:r>
+    </w:p>
+    <w:p>
+      <w:pPr>
+        <w:pStyle w:val="ListParagraph"/>
+        <w:numPr>
+          <w:ilvl w:val="0"/>
+          <w:numId w:val="3"/>
+        </w:numPr>
+      </w:pPr>
+      <w:r>
+        <w:rPr>
+          <w:rFonts w:ascii="Calibri" w:cs="Calibri" w:eastAsia="Calibri" w:hAnsi="Calibri"/>
+          <w:sz w:val="22"/>
+          <w:szCs w:val="22"/>
+        </w:rPr>
+        <w:t xml:space="preserve">Private Key vom lokalen Dateisystem löschen sobald er sicher gespeichert ist:</w:t>
+      </w:r>
+    </w:p>
+    <w:p>
+      <w:pPr>
+        <w:shd w:fill="F0F0F0" w:val="clear"/>
+        <w:spacing w:after="40"/>
+        <w:ind w:left="480"/>
+      </w:pPr>
+      <w:r>
+        <w:rPr>
+          <w:rFonts w:ascii="Courier New" w:cs="Courier New" w:eastAsia="Courier New" w:hAnsi="Courier New"/>
+          <w:sz w:val="20"/>
+          <w:szCs w:val="20"/>
+        </w:rPr>
+        <w:t xml:space="preserve">shred -u kirchenplanung-backup.PRIVAT.asc</w:t>
+      </w:r>
+    </w:p>
+    <w:p>
+      <w:pPr>
+        <w:spacing w:after="80"/>
+      </w:pPr>
+      <w:r>
+        <w:t xml:space="preserve"/>
+      </w:r>
+    </w:p>
+    <w:p>
+      <w:pPr>
+        <w:pStyle w:val="Heading3"/>
+        <w:spacing w:after="60" w:before="160"/>
+      </w:pPr>
+      <w:r>
+        <w:rPr>
+          <w:rFonts w:ascii="Calibri" w:cs="Calibri" w:eastAsia="Calibri" w:hAnsi="Calibri"/>
+          <w:b/>
+          <w:bCs/>
+          <w:color w:val="2E4057"/>
+          <w:sz w:val="22"/>
+          <w:szCs w:val="22"/>
+        </w:rPr>
+        <w:t xml:space="preserve">Regelmässige Prüfung (jährlich)</w:t>
+      </w:r>
+    </w:p>
+    <w:p>
+      <w:pPr>
+        <w:pStyle w:val="ListParagraph"/>
+        <w:numPr>
+          <w:ilvl w:val="0"/>
+          <w:numId w:val="2"/>
+        </w:numPr>
+      </w:pPr>
+      <w:r>
+        <w:rPr>
+          <w:rFonts w:ascii="Calibri" w:cs="Calibri" w:eastAsia="Calibri" w:hAnsi="Calibri"/>
+          <w:sz w:val="22"/>
+          <w:szCs w:val="22"/>
+        </w:rPr>
+        <w:t xml:space="preserve">Ist der Private Key noch am sicheren Ort vorhanden?</w:t>
+      </w:r>
+    </w:p>
+    <w:p>
+      <w:pPr>
+        <w:pStyle w:val="ListParagraph"/>
+        <w:numPr>
+          <w:ilvl w:val="0"/>
+          <w:numId w:val="2"/>
+        </w:numPr>
+      </w:pPr>
+      <w:r>
+        <w:rPr>
+          <w:rFonts w:ascii="Calibri" w:cs="Calibri" w:eastAsia="Calibri" w:hAnsi="Calibri"/>
+          <w:sz w:val="22"/>
+          <w:szCs w:val="22"/>
+        </w:rPr>
+        <w:t xml:space="preserve">Kann ein Backup erfolgreich entschlüsselt werden? → gpg --decrypt latest.sql.gpg | head -5</w:t>
+      </w:r>
+    </w:p>
+    <w:p>
+      <w:pPr>
+        <w:pStyle w:val="ListParagraph"/>
+        <w:numPr>
+          <w:ilvl w:val="0"/>
+          <w:numId w:val="2"/>
+        </w:numPr>
+      </w:pPr>
+      <w:r>
+        <w:rPr>
+          <w:rFonts w:ascii="Calibri" w:cs="Calibri" w:eastAsia="Calibri" w:hAnsi="Calibri"/>
+          <w:sz w:val="22"/>
+          <w:szCs w:val="22"/>
+        </w:rPr>
+        <w:t xml:space="preserve">Kennt mindestens eine zweite Person den Aufbewahrungsort des Private Keys (Notfallzugang)?</w:t>
+      </w:r>
+    </w:p>
+    <w:p>
+      <w:pPr>
+        <w:spacing w:after="80"/>
+      </w:pPr>
+      <w:r>
+        <w:t xml:space="preserve"/>
+      </w:r>
+    </w:p>
+    <w:p>
+      <w:pPr>
+        <w:pStyle w:val="Heading3"/>
+        <w:spacing w:after="60" w:before="160"/>
+      </w:pPr>
+      <w:r>
+        <w:rPr>
+          <w:rFonts w:ascii="Calibri" w:cs="Calibri" w:eastAsia="Calibri" w:hAnsi="Calibri"/>
+          <w:b/>
+          <w:bCs/>
+          <w:color w:val="2E4057"/>
+          <w:sz w:val="22"/>
+          <w:szCs w:val="22"/>
+        </w:rPr>
+        <w:t xml:space="preserve">Schlüssel erneuern (nach Ablauf oder Kompromittierung)</w:t>
+      </w:r>
+    </w:p>
+    <w:p>
+      <w:pPr>
+        <w:pStyle w:val="ListParagraph"/>
+        <w:numPr>
+          <w:ilvl w:val="0"/>
+          <w:numId w:val="3"/>
+        </w:numPr>
+      </w:pPr>
+      <w:r>
+        <w:rPr>
+          <w:rFonts w:ascii="Calibri" w:cs="Calibri" w:eastAsia="Calibri" w:hAnsi="Calibri"/>
+          <w:sz w:val="22"/>
+          <w:szCs w:val="22"/>
+        </w:rPr>
+        <w:t xml:space="preserve">Neues Schlüsselpaar generieren (wie oben)</w:t>
+      </w:r>
+    </w:p>
+    <w:p>
+      <w:pPr>
+        <w:pStyle w:val="ListParagraph"/>
+        <w:numPr>
+          <w:ilvl w:val="0"/>
+          <w:numId w:val="3"/>
+        </w:numPr>
+      </w:pPr>
+      <w:r>
+        <w:rPr>
+          <w:rFonts w:ascii="Calibri" w:cs="Calibri" w:eastAsia="Calibri" w:hAnsi="Calibri"/>
+          <w:sz w:val="22"/>
+          <w:szCs w:val="22"/>
+        </w:rPr>
+        <w:t xml:space="preserve">Public Key auf VPS deployen</w:t>
+      </w:r>
+    </w:p>
+    <w:p>
+      <w:pPr>
+        <w:pStyle w:val="ListParagraph"/>
+        <w:numPr>
+          <w:ilvl w:val="0"/>
+          <w:numId w:val="3"/>
+        </w:numPr>
+      </w:pPr>
+      <w:r>
+        <w:rPr>
+          <w:rFonts w:ascii="Calibri" w:cs="Calibri" w:eastAsia="Calibri" w:hAnsi="Calibri"/>
+          <w:sz w:val="22"/>
+          <w:szCs w:val="22"/>
+        </w:rPr>
+        <w:t xml:space="preserve">Alten Public Key vom VPS entfernen:</w:t>
+      </w:r>
+    </w:p>
+    <w:p>
+      <w:pPr>
+        <w:shd w:fill="F0F0F0" w:val="clear"/>
+        <w:spacing w:after="40"/>
+        <w:ind w:left="480"/>
+      </w:pPr>
+      <w:r>
+        <w:rPr>
+          <w:rFonts w:ascii="Courier New" w:cs="Courier New" w:eastAsia="Courier New" w:hAnsi="Courier New"/>
+          <w:sz w:val="20"/>
+          <w:szCs w:val="20"/>
+        </w:rPr>
+        <w:t xml:space="preserve">gpg --delete-key ALTERKEY</w:t>
+      </w:r>
+    </w:p>
+    <w:p>
+      <w:pPr>
+        <w:pStyle w:val="ListParagraph"/>
+        <w:numPr>
+          <w:ilvl w:val="0"/>
+          <w:numId w:val="3"/>
+        </w:numPr>
+      </w:pPr>
+      <w:r>
+        <w:rPr>
+          <w:rFonts w:ascii="Calibri" w:cs="Calibri" w:eastAsia="Calibri" w:hAnsi="Calibri"/>
+          <w:sz w:val="22"/>
+          <w:szCs w:val="22"/>
+        </w:rPr>
+        <w:t xml:space="preserve">GPG_KEY_ID in .env aktualisieren</w:t>
+      </w:r>
+    </w:p>
+    <w:p>
+      <w:pPr>
+        <w:pStyle w:val="ListParagraph"/>
+        <w:numPr>
+          <w:ilvl w:val="0"/>
+          <w:numId w:val="3"/>
+        </w:numPr>
+      </w:pPr>
+      <w:r>
+        <w:rPr>
+          <w:rFonts w:ascii="Calibri" w:cs="Calibri" w:eastAsia="Calibri" w:hAnsi="Calibri"/>
+          <w:sz w:val="22"/>
+          <w:szCs w:val="22"/>
+        </w:rPr>
+        <w:t xml:space="preserve">Alten Private Key sicher vernichten (shred)</w:t>
+      </w:r>
+    </w:p>
+    <w:p>
+      <w:pPr>
+        <w:pBdr>
+          <w:left w:val="single" w:color="E59866" w:sz="6" w:space="8"/>
+        </w:pBdr>
+        <w:spacing w:after="120" w:before="60"/>
+        <w:ind w:left="360"/>
+      </w:pPr>
+      <w:r>
+        <w:rPr>
+          <w:rFonts w:ascii="Calibri" w:cs="Calibri" w:eastAsia="Calibri" w:hAnsi="Calibri"/>
+          <w:i/>
+          <w:iCs/>
+          <w:color w:val="8B4000"/>
+          <w:sz w:val="20"/>
+          <w:szCs w:val="20"/>
+        </w:rPr>
+        <w:t xml:space="preserve">⚠ Alte Backups die mit dem alten Key verschlüsselt wurden bleiben nur mit dem alten Private Key entschlüsselbar. Alten Private Key daher aufbewahren bis alle alten Backups abgelaufen sind (90 Tage Rotation).</w:t>
+      </w:r>
+    </w:p>
+    <w:p>
+      <w:pPr>
+        <w:spacing w:after="80"/>
+      </w:pPr>
+      <w:r>
+        <w:t xml:space="preserve"/>
+      </w:r>
+    </w:p>
+    <w:p>
+      <w:pPr>
         <w:pStyle w:val="Heading1"/>
         <w:pBdr>
           <w:bottom w:val="single" w:color="AABBD0" w:sz="4" w:space="1"/>
@@ -2610,7 +3637,7 @@
           <w:sz w:val="18"/>
           <w:szCs w:val="18"/>
         </w:rPr>
-        <w:t xml:space="preserve">[ TECHNISCHER ABSCHNITT — erfordert Linux/Docker-Kenntnisse ]</w:t>
+        <w:t xml:space="preserve">[ TECHNISCHER ABSCHNITT — erfordert Linux/GPG-Kenntnisse ]</w:t>
       </w:r>
     </w:p>
     <w:p>
@@ -2644,7 +3671,7 @@
           <w:sz w:val="22"/>
           <w:szCs w:val="22"/>
         </w:rPr>
-        <w:t xml:space="preserve">In das App-Verzeichnis wechseln:</w:t>
+        <w:t xml:space="preserve">Verzeichnis wechseln:</w:t>
       </w:r>
     </w:p>
     <w:p>
@@ -2676,7 +3703,7 @@
           <w:sz w:val="22"/>
           <w:szCs w:val="22"/>
         </w:rPr>
-        <w:t xml:space="preserve">Aktuellen Stand holen:</w:t>
+        <w:t xml:space="preserve">Stand holen:</w:t>
       </w:r>
     </w:p>
     <w:p>
@@ -2708,7 +3735,7 @@
           <w:sz w:val="22"/>
           <w:szCs w:val="22"/>
         </w:rPr>
-        <w:t xml:space="preserve">Neues Image bauen:</w:t>
+        <w:t xml:space="preserve">Image bauen:</w:t>
       </w:r>
     </w:p>
     <w:p>
@@ -2740,7 +3767,7 @@
           <w:sz w:val="22"/>
           <w:szCs w:val="22"/>
         </w:rPr>
-        <w:t xml:space="preserve">Datenbankmigrationen ausführen (falls vorhanden):</w:t>
+        <w:t xml:space="preserve">Migrationen:</w:t>
       </w:r>
     </w:p>
     <w:p>
@@ -2772,7 +3799,7 @@
           <w:sz w:val="22"/>
           <w:szCs w:val="22"/>
         </w:rPr>
-        <w:t xml:space="preserve">App-Container neu starten (DB und nginx laufen weiter):</w:t>
+        <w:t xml:space="preserve">App neu starten:</w:t>
       </w:r>
     </w:p>
     <w:p>
@@ -2869,19 +3896,6 @@
     </w:p>
     <w:p>
       <w:pPr>
-        <w:spacing w:after="120"/>
-      </w:pPr>
-      <w:r>
-        <w:rPr>
-          <w:rFonts w:ascii="Calibri" w:cs="Calibri" w:eastAsia="Calibri" w:hAnsi="Calibri"/>
-          <w:sz w:val="22"/>
-          <w:szCs w:val="22"/>
-        </w:rPr>
-        <w:t xml:space="preserve">Monatlich empfohlen:</w:t>
-      </w:r>
-    </w:p>
-    <w:p>
-      <w:pPr>
         <w:shd w:fill="F0F0F0" w:val="clear"/>
         <w:spacing w:after="40"/>
         <w:ind w:left="480"/>
@@ -2893,36 +3907,6 @@
           <w:szCs w:val="20"/>
         </w:rPr>
         <w:t xml:space="preserve">apt update &amp;&amp; apt upgrade -y</w:t>
-      </w:r>
-    </w:p>
-    <w:p>
-      <w:pPr>
-        <w:shd w:fill="F0F0F0" w:val="clear"/>
-        <w:spacing w:after="40"/>
-        <w:ind w:left="480"/>
-      </w:pPr>
-      <w:r>
-        <w:rPr>
-          <w:rFonts w:ascii="Courier New" w:cs="Courier New" w:eastAsia="Courier New" w:hAnsi="Courier New"/>
-          <w:sz w:val="20"/>
-          <w:szCs w:val="20"/>
-        </w:rPr>
-        <w:t xml:space="preserve"># Reboot nur wenn Kernel-Update:</w:t>
-      </w:r>
-    </w:p>
-    <w:p>
-      <w:pPr>
-        <w:shd w:fill="F0F0F0" w:val="clear"/>
-        <w:spacing w:after="40"/>
-        <w:ind w:left="480"/>
-      </w:pPr>
-      <w:r>
-        <w:rPr>
-          <w:rFonts w:ascii="Courier New" w:cs="Courier New" w:eastAsia="Courier New" w:hAnsi="Courier New"/>
-          <w:sz w:val="20"/>
-          <w:szCs w:val="20"/>
-        </w:rPr>
-        <w:t xml:space="preserve">reboot</w:t>
       </w:r>
     </w:p>
     <w:p>
@@ -2952,19 +3936,6 @@
     </w:p>
     <w:p>
       <w:pPr>
-        <w:spacing w:after="120"/>
-      </w:pPr>
-      <w:r>
-        <w:rPr>
-          <w:rFonts w:ascii="Calibri" w:cs="Calibri" w:eastAsia="Calibri" w:hAnsi="Calibri"/>
-          <w:sz w:val="22"/>
-          <w:szCs w:val="22"/>
-        </w:rPr>
-        <w:t xml:space="preserve">Let's Encrypt-Zertifikate laufen nach 90 Tagen ab. Certbot erneuert automatisch:</w:t>
-      </w:r>
-    </w:p>
-    <w:p>
-      <w:pPr>
         <w:shd w:fill="F0F0F0" w:val="clear"/>
         <w:spacing w:after="40"/>
         <w:ind w:left="480"/>
@@ -2975,7 +3946,7 @@
           <w:sz w:val="20"/>
           <w:szCs w:val="20"/>
         </w:rPr>
-        <w:t xml:space="preserve"># Automatische Erneuerung prüfen:</w:t>
+        <w:t xml:space="preserve">systemctl status certbot.timer</w:t>
       </w:r>
     </w:p>
     <w:p>
@@ -2990,37 +3961,7 @@
           <w:sz w:val="20"/>
           <w:szCs w:val="20"/>
         </w:rPr>
-        <w:t xml:space="preserve">systemctl status certbot.timer</w:t>
-      </w:r>
-    </w:p>
-    <w:p>
-      <w:pPr>
-        <w:shd w:fill="F0F0F0" w:val="clear"/>
-        <w:spacing w:after="40"/>
-        <w:ind w:left="480"/>
-      </w:pPr>
-      <w:r>
-        <w:rPr>
-          <w:rFonts w:ascii="Courier New" w:cs="Courier New" w:eastAsia="Courier New" w:hAnsi="Courier New"/>
-          <w:sz w:val="20"/>
-          <w:szCs w:val="20"/>
-        </w:rPr>
-        <w:t xml:space="preserve"># Manuell erneuern (falls nötig):</w:t>
-      </w:r>
-    </w:p>
-    <w:p>
-      <w:pPr>
-        <w:shd w:fill="F0F0F0" w:val="clear"/>
-        <w:spacing w:after="40"/>
-        <w:ind w:left="480"/>
-      </w:pPr>
-      <w:r>
-        <w:rPr>
-          <w:rFonts w:ascii="Courier New" w:cs="Courier New" w:eastAsia="Courier New" w:hAnsi="Courier New"/>
-          <w:sz w:val="20"/>
-          <w:szCs w:val="20"/>
-        </w:rPr>
-        <w:t xml:space="preserve">certbot renew</w:t>
+        <w:t xml:space="preserve">certbot renew   # manuell falls nötig</w:t>
       </w:r>
     </w:p>
     <w:p>
@@ -3045,20 +3986,7 @@
           <w:sz w:val="24"/>
           <w:szCs w:val="24"/>
         </w:rPr>
-        <w:t xml:space="preserve">4.4 Docker-Wartung</w:t>
-      </w:r>
-    </w:p>
-    <w:p>
-      <w:pPr>
-        <w:spacing w:after="120"/>
-      </w:pPr>
-      <w:r>
-        <w:rPr>
-          <w:rFonts w:ascii="Calibri" w:cs="Calibri" w:eastAsia="Calibri" w:hAnsi="Calibri"/>
-          <w:sz w:val="22"/>
-          <w:szCs w:val="22"/>
-        </w:rPr>
-        <w:t xml:space="preserve">Vierteljährlich empfohlen — ungenutzte Images und Volumes entfernen:</w:t>
+        <w:t xml:space="preserve">4.4 Docker-Wartung (vierteljährlich)</w:t>
       </w:r>
     </w:p>
     <w:p>
@@ -3074,21 +4002,6 @@
           <w:szCs w:val="20"/>
         </w:rPr>
         <w:t xml:space="preserve">docker system prune -f</w:t>
-      </w:r>
-    </w:p>
-    <w:p>
-      <w:pPr>
-        <w:shd w:fill="F0F0F0" w:val="clear"/>
-        <w:spacing w:after="40"/>
-        <w:ind w:left="480"/>
-      </w:pPr>
-      <w:r>
-        <w:rPr>
-          <w:rFonts w:ascii="Courier New" w:cs="Courier New" w:eastAsia="Courier New" w:hAnsi="Courier New"/>
-          <w:sz w:val="20"/>
-          <w:szCs w:val="20"/>
-        </w:rPr>
-        <w:t xml:space="preserve">docker volume prune -f   # ACHTUNG: nur wenn alle Container laufen</w:t>
       </w:r>
     </w:p>
     <w:p>
@@ -3128,22 +4041,7 @@
           <w:sz w:val="20"/>
           <w:szCs w:val="20"/>
         </w:rPr>
-        <w:t xml:space="preserve">docker compose exec db psql -U kp_app kirchenplanung -c "</w:t>
-      </w:r>
-    </w:p>
-    <w:p>
-      <w:pPr>
-        <w:shd w:fill="F0F0F0" w:val="clear"/>
-        <w:spacing w:after="40"/>
-        <w:ind w:left="480"/>
-      </w:pPr>
-      <w:r>
-        <w:rPr>
-          <w:rFonts w:ascii="Courier New" w:cs="Courier New" w:eastAsia="Courier New" w:hAnsi="Courier New"/>
-          <w:sz w:val="20"/>
-          <w:szCs w:val="20"/>
-        </w:rPr>
-        <w:t xml:space="preserve">  SELECT pg_size_pretty(pg_database_size('kirchenplanung'));"</w:t>
+        <w:t xml:space="preserve">docker compose exec db psql -U kp_app kirchenplanung -c "SELECT pg_size_pretty(pg_database_size('kirchenplanung'));"</w:t>
       </w:r>
     </w:p>
     <w:p>
@@ -3204,7 +4102,7 @@
           <w:sz w:val="18"/>
           <w:szCs w:val="18"/>
         </w:rPr>
-        <w:t xml:space="preserve">[ TECHNISCHER ABSCHNITT — erfordert Linux/Docker-Kenntnisse ]</w:t>
+        <w:t xml:space="preserve">[ TECHNISCHER ABSCHNITT — erfordert Linux/GPG-Kenntnisse ]</w:t>
       </w:r>
     </w:p>
     <w:tbl>
@@ -3247,7 +4145,6 @@
                 <w:rFonts w:ascii="Calibri" w:cs="Calibri" w:eastAsia="Calibri" w:hAnsi="Calibri"/>
                 <w:b/>
                 <w:bCs/>
-                <w:color w:val="000000"/>
                 <w:sz w:val="20"/>
                 <w:szCs w:val="20"/>
               </w:rPr>
@@ -3278,7 +4175,6 @@
                 <w:rFonts w:ascii="Calibri" w:cs="Calibri" w:eastAsia="Calibri" w:hAnsi="Calibri"/>
                 <w:b/>
                 <w:bCs/>
-                <w:color w:val="000000"/>
                 <w:sz w:val="20"/>
                 <w:szCs w:val="20"/>
               </w:rPr>
@@ -3311,11 +4207,10 @@
                 <w:rFonts w:ascii="Calibri" w:cs="Calibri" w:eastAsia="Calibri" w:hAnsi="Calibri"/>
                 <w:b w:val="false"/>
                 <w:bCs w:val="false"/>
-                <w:color w:val="000000"/>
-                <w:sz w:val="20"/>
-                <w:szCs w:val="20"/>
-              </w:rPr>
-              <w:t xml:space="preserve">Container-Status prüfen</w:t>
+                <w:sz w:val="20"/>
+                <w:szCs w:val="20"/>
+              </w:rPr>
+              <w:t xml:space="preserve">Container-Status</w:t>
             </w:r>
           </w:p>
         </w:tc>
@@ -3342,7 +4237,6 @@
                 <w:rFonts w:ascii="Calibri" w:cs="Calibri" w:eastAsia="Calibri" w:hAnsi="Calibri"/>
                 <w:b w:val="false"/>
                 <w:bCs w:val="false"/>
-                <w:color w:val="000000"/>
                 <w:sz w:val="20"/>
                 <w:szCs w:val="20"/>
               </w:rPr>
@@ -3375,11 +4269,10 @@
                 <w:rFonts w:ascii="Calibri" w:cs="Calibri" w:eastAsia="Calibri" w:hAnsi="Calibri"/>
                 <w:b w:val="false"/>
                 <w:bCs w:val="false"/>
-                <w:color w:val="000000"/>
-                <w:sz w:val="20"/>
-                <w:szCs w:val="20"/>
-              </w:rPr>
-              <w:t xml:space="preserve">App-Logs ansehen</w:t>
+                <w:sz w:val="20"/>
+                <w:szCs w:val="20"/>
+              </w:rPr>
+              <w:t xml:space="preserve">App-Logs</w:t>
             </w:r>
           </w:p>
         </w:tc>
@@ -3406,7 +4299,6 @@
                 <w:rFonts w:ascii="Calibri" w:cs="Calibri" w:eastAsia="Calibri" w:hAnsi="Calibri"/>
                 <w:b w:val="false"/>
                 <w:bCs w:val="false"/>
-                <w:color w:val="000000"/>
                 <w:sz w:val="20"/>
                 <w:szCs w:val="20"/>
               </w:rPr>
@@ -3439,11 +4331,10 @@
                 <w:rFonts w:ascii="Calibri" w:cs="Calibri" w:eastAsia="Calibri" w:hAnsi="Calibri"/>
                 <w:b w:val="false"/>
                 <w:bCs w:val="false"/>
-                <w:color w:val="000000"/>
-                <w:sz w:val="20"/>
-                <w:szCs w:val="20"/>
-              </w:rPr>
-              <w:t xml:space="preserve">DB-Logs ansehen</w:t>
+                <w:sz w:val="20"/>
+                <w:szCs w:val="20"/>
+              </w:rPr>
+              <w:t xml:space="preserve">DB-Logs</w:t>
             </w:r>
           </w:p>
         </w:tc>
@@ -3470,7 +4361,6 @@
                 <w:rFonts w:ascii="Calibri" w:cs="Calibri" w:eastAsia="Calibri" w:hAnsi="Calibri"/>
                 <w:b w:val="false"/>
                 <w:bCs w:val="false"/>
-                <w:color w:val="000000"/>
                 <w:sz w:val="20"/>
                 <w:szCs w:val="20"/>
               </w:rPr>
@@ -3503,11 +4393,10 @@
                 <w:rFonts w:ascii="Calibri" w:cs="Calibri" w:eastAsia="Calibri" w:hAnsi="Calibri"/>
                 <w:b w:val="false"/>
                 <w:bCs w:val="false"/>
-                <w:color w:val="000000"/>
-                <w:sz w:val="20"/>
-                <w:szCs w:val="20"/>
-              </w:rPr>
-              <w:t xml:space="preserve">Nginx-Logs ansehen</w:t>
+                <w:sz w:val="20"/>
+                <w:szCs w:val="20"/>
+              </w:rPr>
+              <w:t xml:space="preserve">Datenbankverbindung testen</w:t>
             </w:r>
           </w:p>
         </w:tc>
@@ -3534,11 +4423,10 @@
                 <w:rFonts w:ascii="Calibri" w:cs="Calibri" w:eastAsia="Calibri" w:hAnsi="Calibri"/>
                 <w:b w:val="false"/>
                 <w:bCs w:val="false"/>
-                <w:color w:val="000000"/>
-                <w:sz w:val="20"/>
-                <w:szCs w:val="20"/>
-              </w:rPr>
-              <w:t xml:space="preserve">docker compose logs -f nginx --tail=50</w:t>
+                <w:sz w:val="20"/>
+                <w:szCs w:val="20"/>
+              </w:rPr>
+              <w:t xml:space="preserve">docker compose exec db pg_isready -U kp_app</w:t>
             </w:r>
           </w:p>
         </w:tc>
@@ -3567,11 +4455,10 @@
                 <w:rFonts w:ascii="Calibri" w:cs="Calibri" w:eastAsia="Calibri" w:hAnsi="Calibri"/>
                 <w:b w:val="false"/>
                 <w:bCs w:val="false"/>
-                <w:color w:val="000000"/>
-                <w:sz w:val="20"/>
-                <w:szCs w:val="20"/>
-              </w:rPr>
-              <w:t xml:space="preserve">Datenbankverbindung testen</w:t>
+                <w:sz w:val="20"/>
+                <w:szCs w:val="20"/>
+              </w:rPr>
+              <w:t xml:space="preserve">Speicherplatz</w:t>
             </w:r>
           </w:p>
         </w:tc>
@@ -3598,11 +4485,10 @@
                 <w:rFonts w:ascii="Calibri" w:cs="Calibri" w:eastAsia="Calibri" w:hAnsi="Calibri"/>
                 <w:b w:val="false"/>
                 <w:bCs w:val="false"/>
-                <w:color w:val="000000"/>
-                <w:sz w:val="20"/>
-                <w:szCs w:val="20"/>
-              </w:rPr>
-              <w:t xml:space="preserve">docker compose exec db pg_isready -U kp_app</w:t>
+                <w:sz w:val="20"/>
+                <w:szCs w:val="20"/>
+              </w:rPr>
+              <w:t xml:space="preserve">df -h</w:t>
             </w:r>
           </w:p>
         </w:tc>
@@ -3631,11 +4517,10 @@
                 <w:rFonts w:ascii="Calibri" w:cs="Calibri" w:eastAsia="Calibri" w:hAnsi="Calibri"/>
                 <w:b w:val="false"/>
                 <w:bCs w:val="false"/>
-                <w:color w:val="000000"/>
-                <w:sz w:val="20"/>
-                <w:szCs w:val="20"/>
-              </w:rPr>
-              <w:t xml:space="preserve">Speicherplatz prüfen</w:t>
+                <w:sz w:val="20"/>
+                <w:szCs w:val="20"/>
+              </w:rPr>
+              <w:t xml:space="preserve">RAM-Auslastung</w:t>
             </w:r>
           </w:p>
         </w:tc>
@@ -3662,71 +4547,6 @@
                 <w:rFonts w:ascii="Calibri" w:cs="Calibri" w:eastAsia="Calibri" w:hAnsi="Calibri"/>
                 <w:b w:val="false"/>
                 <w:bCs w:val="false"/>
-                <w:color w:val="000000"/>
-                <w:sz w:val="20"/>
-                <w:szCs w:val="20"/>
-              </w:rPr>
-              <w:t xml:space="preserve">df -h</w:t>
-            </w:r>
-          </w:p>
-        </w:tc>
-      </w:tr>
-      <w:tr>
-        <w:tc>
-          <w:tcPr>
-            <w:tcW w:type="dxa" w:w="3200"/>
-            <w:tcBorders>
-              <w:top w:val="single" w:color="BBCCDD" w:sz="1"/>
-              <w:left w:val="single" w:color="BBCCDD" w:sz="1"/>
-              <w:bottom w:val="single" w:color="BBCCDD" w:sz="1"/>
-              <w:right w:val="single" w:color="BBCCDD" w:sz="1"/>
-            </w:tcBorders>
-            <w:shd w:fill="FFFFFF" w:val="clear"/>
-            <w:tcMar>
-              <w:top w:type="dxa" w:w="80"/>
-              <w:left w:type="dxa" w:w="120"/>
-              <w:bottom w:type="dxa" w:w="80"/>
-              <w:right w:type="dxa" w:w="120"/>
-            </w:tcMar>
-          </w:tcPr>
-          <w:p>
-            <w:r>
-              <w:rPr>
-                <w:rFonts w:ascii="Calibri" w:cs="Calibri" w:eastAsia="Calibri" w:hAnsi="Calibri"/>
-                <w:b w:val="false"/>
-                <w:bCs w:val="false"/>
-                <w:color w:val="000000"/>
-                <w:sz w:val="20"/>
-                <w:szCs w:val="20"/>
-              </w:rPr>
-              <w:t xml:space="preserve">RAM-Auslastung prüfen</w:t>
-            </w:r>
-          </w:p>
-        </w:tc>
-        <w:tc>
-          <w:tcPr>
-            <w:tcW w:type="dxa" w:w="5826"/>
-            <w:tcBorders>
-              <w:top w:val="single" w:color="BBCCDD" w:sz="1"/>
-              <w:left w:val="single" w:color="BBCCDD" w:sz="1"/>
-              <w:bottom w:val="single" w:color="BBCCDD" w:sz="1"/>
-              <w:right w:val="single" w:color="BBCCDD" w:sz="1"/>
-            </w:tcBorders>
-            <w:shd w:fill="FFFFFF" w:val="clear"/>
-            <w:tcMar>
-              <w:top w:type="dxa" w:w="80"/>
-              <w:left w:type="dxa" w:w="120"/>
-              <w:bottom w:type="dxa" w:w="80"/>
-              <w:right w:type="dxa" w:w="120"/>
-            </w:tcMar>
-          </w:tcPr>
-          <w:p>
-            <w:r>
-              <w:rPr>
-                <w:rFonts w:ascii="Calibri" w:cs="Calibri" w:eastAsia="Calibri" w:hAnsi="Calibri"/>
-                <w:b w:val="false"/>
-                <w:bCs w:val="false"/>
-                <w:color w:val="000000"/>
                 <w:sz w:val="20"/>
                 <w:szCs w:val="20"/>
               </w:rPr>
@@ -3809,7 +4629,7 @@
           <w:sz w:val="22"/>
           <w:szCs w:val="22"/>
         </w:rPr>
-        <w:t xml:space="preserve">TLS-Zertifikat abgelaufen? → certbot renew</w:t>
+        <w:t xml:space="preserve">TLS abgelaufen? → certbot renew</w:t>
       </w:r>
     </w:p>
     <w:p>
@@ -3826,7 +4646,32 @@
           <w:sz w:val="22"/>
           <w:szCs w:val="22"/>
         </w:rPr>
-        <w:t xml:space="preserve">VPS erreichbar? → ping kirchenplanung.example.ch</w:t>
+        <w:t xml:space="preserve">Port 443 offen? → Infomaniak Firewall prüfen</w:t>
+      </w:r>
+    </w:p>
+    <w:p>
+      <w:pPr>
+        <w:spacing w:after="80"/>
+      </w:pPr>
+      <w:r>
+        <w:t xml:space="preserve"/>
+      </w:r>
+    </w:p>
+    <w:p>
+      <w:pPr>
+        <w:pStyle w:val="Heading3"/>
+        <w:spacing w:after="60" w:before="160"/>
+      </w:pPr>
+      <w:r>
+        <w:rPr>
+          <w:rFonts w:ascii="Calibri" w:cs="Calibri" w:eastAsia="Calibri" w:hAnsi="Calibri"/>
+          <w:b/>
+          <w:bCs/>
+          <w:color w:val="2E4057"/>
+          <w:sz w:val="22"/>
+          <w:szCs w:val="22"/>
+        </w:rPr>
+        <w:t xml:space="preserve">Login funktioniert nicht</w:t>
       </w:r>
     </w:p>
     <w:p>
@@ -3843,32 +4688,7 @@
           <w:sz w:val="22"/>
           <w:szCs w:val="22"/>
         </w:rPr>
-        <w:t xml:space="preserve">Port 443 offen? → Infomaniak Firewall-Einstellungen prüfen</w:t>
-      </w:r>
-    </w:p>
-    <w:p>
-      <w:pPr>
-        <w:spacing w:after="80"/>
-      </w:pPr>
-      <w:r>
-        <w:t xml:space="preserve"/>
-      </w:r>
-    </w:p>
-    <w:p>
-      <w:pPr>
-        <w:pStyle w:val="Heading3"/>
-        <w:spacing w:after="60" w:before="160"/>
-      </w:pPr>
-      <w:r>
-        <w:rPr>
-          <w:rFonts w:ascii="Calibri" w:cs="Calibri" w:eastAsia="Calibri" w:hAnsi="Calibri"/>
-          <w:b/>
-          <w:bCs/>
-          <w:color w:val="2E4057"/>
-          <w:sz w:val="22"/>
-          <w:szCs w:val="22"/>
-        </w:rPr>
-        <w:t xml:space="preserve">Login funktioniert nicht</w:t>
+        <w:t xml:space="preserve">App-Container läuft? → docker compose ps</w:t>
       </w:r>
     </w:p>
     <w:p>
@@ -3885,7 +4705,7 @@
           <w:sz w:val="22"/>
           <w:szCs w:val="22"/>
         </w:rPr>
-        <w:t xml:space="preserve">App-Container läuft? → docker compose ps</w:t>
+        <w:t xml:space="preserve">Fehler im Log? → docker compose logs app | grep -i error</w:t>
       </w:r>
     </w:p>
     <w:p>
@@ -3902,7 +4722,32 @@
           <w:sz w:val="22"/>
           <w:szCs w:val="22"/>
         </w:rPr>
-        <w:t xml:space="preserve">Datenbankverbindung? → docker compose logs app | grep -i error</w:t>
+        <w:t xml:space="preserve">Passwort vergessen: Admin kann zurücksetzen</w:t>
+      </w:r>
+    </w:p>
+    <w:p>
+      <w:pPr>
+        <w:spacing w:after="80"/>
+      </w:pPr>
+      <w:r>
+        <w:t xml:space="preserve"/>
+      </w:r>
+    </w:p>
+    <w:p>
+      <w:pPr>
+        <w:pStyle w:val="Heading3"/>
+        <w:spacing w:after="60" w:before="160"/>
+      </w:pPr>
+      <w:r>
+        <w:rPr>
+          <w:rFonts w:ascii="Calibri" w:cs="Calibri" w:eastAsia="Calibri" w:hAnsi="Calibri"/>
+          <w:b/>
+          <w:bCs/>
+          <w:color w:val="2E4057"/>
+          <w:sz w:val="22"/>
+          <w:szCs w:val="22"/>
+        </w:rPr>
+        <w:t xml:space="preserve">Backup schlägt fehl</w:t>
       </w:r>
     </w:p>
     <w:p>
@@ -3919,7 +4764,7 @@
           <w:sz w:val="22"/>
           <w:szCs w:val="22"/>
         </w:rPr>
-        <w:t xml:space="preserve">Passwort vergessen: Admin kann Passwort im Admin-Bereich zurücksetzen</w:t>
+        <w:t xml:space="preserve">GPG-Key vorhanden? → gpg --list-keys</w:t>
       </w:r>
     </w:p>
     <w:p>
@@ -3936,32 +4781,7 @@
           <w:sz w:val="22"/>
           <w:szCs w:val="22"/>
         </w:rPr>
-        <w:t xml:space="preserve">Account gesperrt (is_active = false): Admin muss Konto reaktivieren</w:t>
-      </w:r>
-    </w:p>
-    <w:p>
-      <w:pPr>
-        <w:spacing w:after="80"/>
-      </w:pPr>
-      <w:r>
-        <w:t xml:space="preserve"/>
-      </w:r>
-    </w:p>
-    <w:p>
-      <w:pPr>
-        <w:pStyle w:val="Heading3"/>
-        <w:spacing w:after="60" w:before="160"/>
-      </w:pPr>
-      <w:r>
-        <w:rPr>
-          <w:rFonts w:ascii="Calibri" w:cs="Calibri" w:eastAsia="Calibri" w:hAnsi="Calibri"/>
-          <w:b/>
-          <w:bCs/>
-          <w:color w:val="2E4057"/>
-          <w:sz w:val="22"/>
-          <w:szCs w:val="22"/>
-        </w:rPr>
-        <w:t xml:space="preserve">Fehler beim Erstellen eines Anlasses</w:t>
+        <w:t xml:space="preserve">Speicherplatz? → df -h</w:t>
       </w:r>
     </w:p>
     <w:p>
@@ -3978,245 +4798,7 @@
           <w:sz w:val="22"/>
           <w:szCs w:val="22"/>
         </w:rPr>
-        <w:t xml:space="preserve">Raumkonflikt: anderer Anlass belegt den Raum — Konflikt-Hinweis im Formular beachten</w:t>
-      </w:r>
-    </w:p>
-    <w:p>
-      <w:pPr>
-        <w:pStyle w:val="ListParagraph"/>
-        <w:numPr>
-          <w:ilvl w:val="0"/>
-          <w:numId w:val="2"/>
-        </w:numPr>
-      </w:pPr>
-      <w:r>
-        <w:rPr>
-          <w:rFonts w:ascii="Calibri" w:cs="Calibri" w:eastAsia="Calibri" w:hAnsi="Calibri"/>
-          <w:sz w:val="22"/>
-          <w:szCs w:val="22"/>
-        </w:rPr>
-        <w:t xml:space="preserve">Sperrzeit: Admin hat eine Sperrzeit für diesen Zeitraum definiert</w:t>
-      </w:r>
-    </w:p>
-    <w:p>
-      <w:pPr>
-        <w:pStyle w:val="ListParagraph"/>
-        <w:numPr>
-          <w:ilvl w:val="0"/>
-          <w:numId w:val="2"/>
-        </w:numPr>
-      </w:pPr>
-      <w:r>
-        <w:rPr>
-          <w:rFonts w:ascii="Calibri" w:cs="Calibri" w:eastAsia="Calibri" w:hAnsi="Calibri"/>
-          <w:sz w:val="22"/>
-          <w:szCs w:val="22"/>
-        </w:rPr>
-        <w:t xml:space="preserve">Berechtigungsfehler: Rolle prüfen — nur Requester und höher können Anlässe erstellen</w:t>
-      </w:r>
-    </w:p>
-    <w:p>
-      <w:pPr>
-        <w:spacing w:after="80"/>
-      </w:pPr>
-      <w:r>
-        <w:t xml:space="preserve"/>
-      </w:r>
-    </w:p>
-    <w:p>
-      <w:pPr>
-        <w:pStyle w:val="Heading3"/>
-        <w:spacing w:after="60" w:before="160"/>
-      </w:pPr>
-      <w:r>
-        <w:rPr>
-          <w:rFonts w:ascii="Calibri" w:cs="Calibri" w:eastAsia="Calibri" w:hAnsi="Calibri"/>
-          <w:b/>
-          <w:bCs/>
-          <w:color w:val="2E4057"/>
-          <w:sz w:val="22"/>
-          <w:szCs w:val="22"/>
-        </w:rPr>
-        <w:t xml:space="preserve">Container startet nicht</w:t>
-      </w:r>
-    </w:p>
-    <w:p>
-      <w:pPr>
-        <w:spacing w:after="80" w:before="80"/>
-      </w:pPr>
-      <w:r>
-        <w:rPr>
-          <w:rFonts w:ascii="Calibri" w:cs="Calibri" w:eastAsia="Calibri" w:hAnsi="Calibri"/>
-          <w:i/>
-          <w:iCs/>
-          <w:color w:val="666666"/>
-          <w:sz w:val="18"/>
-          <w:szCs w:val="18"/>
-        </w:rPr>
-        <w:t xml:space="preserve">[ TECHNISCHER ABSCHNITT — erfordert Linux/Docker-Kenntnisse ]</w:t>
-      </w:r>
-    </w:p>
-    <w:p>
-      <w:pPr>
-        <w:shd w:fill="F0F0F0" w:val="clear"/>
-        <w:spacing w:after="40"/>
-        <w:ind w:left="480"/>
-      </w:pPr>
-      <w:r>
-        <w:rPr>
-          <w:rFonts w:ascii="Courier New" w:cs="Courier New" w:eastAsia="Courier New" w:hAnsi="Courier New"/>
-          <w:sz w:val="20"/>
-          <w:szCs w:val="20"/>
-        </w:rPr>
-        <w:t xml:space="preserve">docker compose logs app</w:t>
-      </w:r>
-    </w:p>
-    <w:p>
-      <w:pPr>
-        <w:pStyle w:val="ListParagraph"/>
-        <w:numPr>
-          <w:ilvl w:val="0"/>
-          <w:numId w:val="2"/>
-        </w:numPr>
-      </w:pPr>
-      <w:r>
-        <w:rPr>
-          <w:rFonts w:ascii="Calibri" w:cs="Calibri" w:eastAsia="Calibri" w:hAnsi="Calibri"/>
-          <w:sz w:val="22"/>
-          <w:szCs w:val="22"/>
-        </w:rPr>
-        <w:t xml:space="preserve">Häufige Ursachen: .env fehlt oder unvollständig, Datenbankverbindung schlägt fehl, Port bereits belegt</w:t>
-      </w:r>
-    </w:p>
-    <w:p>
-      <w:pPr>
-        <w:shd w:fill="F0F0F0" w:val="clear"/>
-        <w:spacing w:after="40"/>
-        <w:ind w:left="480"/>
-      </w:pPr>
-      <w:r>
-        <w:rPr>
-          <w:rFonts w:ascii="Courier New" w:cs="Courier New" w:eastAsia="Courier New" w:hAnsi="Courier New"/>
-          <w:sz w:val="20"/>
-          <w:szCs w:val="20"/>
-        </w:rPr>
-        <w:t xml:space="preserve"># Port-Konflikt prüfen:</w:t>
-      </w:r>
-    </w:p>
-    <w:p>
-      <w:pPr>
-        <w:shd w:fill="F0F0F0" w:val="clear"/>
-        <w:spacing w:after="40"/>
-        <w:ind w:left="480"/>
-      </w:pPr>
-      <w:r>
-        <w:rPr>
-          <w:rFonts w:ascii="Courier New" w:cs="Courier New" w:eastAsia="Courier New" w:hAnsi="Courier New"/>
-          <w:sz w:val="20"/>
-          <w:szCs w:val="20"/>
-        </w:rPr>
-        <w:t xml:space="preserve">ss -tlnp | grep -E '80|443'</w:t>
-      </w:r>
-    </w:p>
-    <w:p>
-      <w:pPr>
-        <w:spacing w:after="80"/>
-      </w:pPr>
-      <w:r>
-        <w:t xml:space="preserve"/>
-      </w:r>
-    </w:p>
-    <w:p>
-      <w:pPr>
-        <w:pStyle w:val="Heading3"/>
-        <w:spacing w:after="60" w:before="160"/>
-      </w:pPr>
-      <w:r>
-        <w:rPr>
-          <w:rFonts w:ascii="Calibri" w:cs="Calibri" w:eastAsia="Calibri" w:hAnsi="Calibri"/>
-          <w:b/>
-          <w:bCs/>
-          <w:color w:val="2E4057"/>
-          <w:sz w:val="22"/>
-          <w:szCs w:val="22"/>
-        </w:rPr>
-        <w:t xml:space="preserve">Datenbankfehler</w:t>
-      </w:r>
-    </w:p>
-    <w:p>
-      <w:pPr>
-        <w:spacing w:after="80" w:before="80"/>
-      </w:pPr>
-      <w:r>
-        <w:rPr>
-          <w:rFonts w:ascii="Calibri" w:cs="Calibri" w:eastAsia="Calibri" w:hAnsi="Calibri"/>
-          <w:i/>
-          <w:iCs/>
-          <w:color w:val="666666"/>
-          <w:sz w:val="18"/>
-          <w:szCs w:val="18"/>
-        </w:rPr>
-        <w:t xml:space="preserve">[ TECHNISCHER ABSCHNITT — erfordert Linux/Docker-Kenntnisse ]</w:t>
-      </w:r>
-    </w:p>
-    <w:p>
-      <w:pPr>
-        <w:shd w:fill="F0F0F0" w:val="clear"/>
-        <w:spacing w:after="40"/>
-        <w:ind w:left="480"/>
-      </w:pPr>
-      <w:r>
-        <w:rPr>
-          <w:rFonts w:ascii="Courier New" w:cs="Courier New" w:eastAsia="Courier New" w:hAnsi="Courier New"/>
-          <w:sz w:val="20"/>
-          <w:szCs w:val="20"/>
-        </w:rPr>
-        <w:t xml:space="preserve">docker compose exec db psql -U kp_app kirchenplanung</w:t>
-      </w:r>
-    </w:p>
-    <w:p>
-      <w:pPr>
-        <w:shd w:fill="F0F0F0" w:val="clear"/>
-        <w:spacing w:after="40"/>
-        <w:ind w:left="480"/>
-      </w:pPr>
-      <w:r>
-        <w:rPr>
-          <w:rFonts w:ascii="Courier New" w:cs="Courier New" w:eastAsia="Courier New" w:hAnsi="Courier New"/>
-          <w:sz w:val="20"/>
-          <w:szCs w:val="20"/>
-        </w:rPr>
-        <w:t xml:space="preserve">\l   # Datenbanken auflisten</w:t>
-      </w:r>
-    </w:p>
-    <w:p>
-      <w:pPr>
-        <w:shd w:fill="F0F0F0" w:val="clear"/>
-        <w:spacing w:after="40"/>
-        <w:ind w:left="480"/>
-      </w:pPr>
-      <w:r>
-        <w:rPr>
-          <w:rFonts w:ascii="Courier New" w:cs="Courier New" w:eastAsia="Courier New" w:hAnsi="Courier New"/>
-          <w:sz w:val="20"/>
-          <w:szCs w:val="20"/>
-        </w:rPr>
-        <w:t xml:space="preserve">\dt  # Tabellen auflisten</w:t>
-      </w:r>
-    </w:p>
-    <w:p>
-      <w:pPr>
-        <w:shd w:fill="F0F0F0" w:val="clear"/>
-        <w:spacing w:after="40"/>
-        <w:ind w:left="480"/>
-      </w:pPr>
-      <w:r>
-        <w:rPr>
-          <w:rFonts w:ascii="Courier New" w:cs="Courier New" w:eastAsia="Courier New" w:hAnsi="Courier New"/>
-          <w:sz w:val="20"/>
-          <w:szCs w:val="20"/>
-        </w:rPr>
-        <w:t xml:space="preserve">\q   # Beenden</w:t>
+        <w:t xml:space="preserve">kDrive erreichbar? → rclone ls kdrive:</w:t>
       </w:r>
     </w:p>
     <w:p>
@@ -4264,7 +4846,7 @@
           <w:sz w:val="20"/>
           <w:szCs w:val="20"/>
         </w:rPr>
-        <w:t xml:space="preserve">ℹ Dieser Abschnitt beschreibt die gesetzlich vorgeschriebenen Datenschutzprozesse gemäss Schweizer DSG.</w:t>
+        <w:t xml:space="preserve">ℹ Gesetzlich vorgeschriebene Datenschutzprozesse gemäss Schweizer DSG.</w:t>
       </w:r>
     </w:p>
     <w:p>
@@ -4289,20 +4871,7 @@
           <w:sz w:val="24"/>
           <w:szCs w:val="24"/>
         </w:rPr>
-        <w:t xml:space="preserve">6.1 Auskunftsrecht — Datenauszug einer Person</w:t>
-      </w:r>
-    </w:p>
-    <w:p>
-      <w:pPr>
-        <w:spacing w:after="120"/>
-      </w:pPr>
-      <w:r>
-        <w:rPr>
-          <w:rFonts w:ascii="Calibri" w:cs="Calibri" w:eastAsia="Calibri" w:hAnsi="Calibri"/>
-          <w:sz w:val="22"/>
-          <w:szCs w:val="22"/>
-        </w:rPr>
-        <w:t xml:space="preserve">Eine Person kann jederzeit Auskunft verlangen über alle gespeicherten Daten. Bearbeitung via Admin-Interface:</w:t>
+        <w:t xml:space="preserve">6.1 Auskunftsrecht — Datenauszug</w:t>
       </w:r>
     </w:p>
     <w:p>
@@ -4319,7 +4888,7 @@
           <w:sz w:val="22"/>
           <w:szCs w:val="22"/>
         </w:rPr>
-        <w:t xml:space="preserve">Im Admin-Bereich einloggen</w:t>
+        <w:t xml:space="preserve">Admin-Bereich → Personen → Person suchen</w:t>
       </w:r>
     </w:p>
     <w:p>
@@ -4336,7 +4905,7 @@
           <w:sz w:val="22"/>
           <w:szCs w:val="22"/>
         </w:rPr>
-        <w:t xml:space="preserve">Personen → Person suchen</w:t>
+        <w:t xml:space="preserve">Schaltfläche "Datenauszug erstellen" klicken</w:t>
       </w:r>
     </w:p>
     <w:p>
@@ -4353,7 +4922,52 @@
           <w:sz w:val="22"/>
           <w:szCs w:val="22"/>
         </w:rPr>
-        <w:t xml:space="preserve">Schaltfläche "Datenauszug erstellen" klicken</w:t>
+        <w:t xml:space="preserve">JSON-Export herunterladen und der anfragenden Person zustellen</w:t>
+      </w:r>
+    </w:p>
+    <w:p>
+      <w:pPr>
+        <w:pBdr>
+          <w:left w:val="single" w:color="3A6B8A" w:sz="6" w:space="8"/>
+        </w:pBdr>
+        <w:spacing w:after="120" w:before="60"/>
+        <w:ind w:left="360"/>
+      </w:pPr>
+      <w:r>
+        <w:rPr>
+          <w:rFonts w:ascii="Calibri" w:cs="Calibri" w:eastAsia="Calibri" w:hAnsi="Calibri"/>
+          <w:i/>
+          <w:iCs/>
+          <w:color w:val="1A5276"/>
+          <w:sz w:val="20"/>
+          <w:szCs w:val="20"/>
+        </w:rPr>
+        <w:t xml:space="preserve">ℹ Export enthält alle Stammdaten, Terminbeteiligungen und Dienstplan-Einträge. Audit-Log gefiltert — keine Daten anderer Personen sichtbar.</w:t>
+      </w:r>
+    </w:p>
+    <w:p>
+      <w:pPr>
+        <w:spacing w:after="80"/>
+      </w:pPr>
+      <w:r>
+        <w:t xml:space="preserve"/>
+      </w:r>
+    </w:p>
+    <w:p>
+      <w:pPr>
+        <w:pStyle w:val="Heading2"/>
+        <w:spacing w:after="80" w:before="240"/>
+      </w:pPr>
+      <w:r>
+        <w:rPr>
+          <w:rFonts w:ascii="Calibri" w:cs="Calibri" w:eastAsia="Calibri" w:hAnsi="Calibri"/>
+          <w:b/>
+          <w:bCs/>
+          <w:color w:val="3A6B8A"/>
+          <w:sz w:val="24"/>
+          <w:szCs w:val="24"/>
+        </w:rPr>
+        <w:t xml:space="preserve">6.2 Recht auf Vergessenwerden — Anonymisierung</w:t>
       </w:r>
     </w:p>
     <w:p>
@@ -4370,7 +4984,82 @@
           <w:sz w:val="22"/>
           <w:szCs w:val="22"/>
         </w:rPr>
-        <w:t xml:space="preserve">JSON-Export herunterladen und der anfragenden Person zustellen (verschlüsselt per E-Mail empfohlen)</w:t>
+        <w:t xml:space="preserve">Admin-Bereich → Personen → Person suchen</w:t>
+      </w:r>
+    </w:p>
+    <w:p>
+      <w:pPr>
+        <w:pStyle w:val="ListParagraph"/>
+        <w:numPr>
+          <w:ilvl w:val="0"/>
+          <w:numId w:val="3"/>
+        </w:numPr>
+      </w:pPr>
+      <w:r>
+        <w:rPr>
+          <w:rFonts w:ascii="Calibri" w:cs="Calibri" w:eastAsia="Calibri" w:hAnsi="Calibri"/>
+          <w:sz w:val="22"/>
+          <w:szCs w:val="22"/>
+        </w:rPr>
+        <w:t xml:space="preserve">Schaltfläche "Person anonymisieren" klicken und bestätigen</w:t>
+      </w:r>
+    </w:p>
+    <w:p>
+      <w:pPr>
+        <w:pBdr>
+          <w:left w:val="single" w:color="E59866" w:sz="6" w:space="8"/>
+        </w:pBdr>
+        <w:spacing w:after="120" w:before="60"/>
+        <w:ind w:left="360"/>
+      </w:pPr>
+      <w:r>
+        <w:rPr>
+          <w:rFonts w:ascii="Calibri" w:cs="Calibri" w:eastAsia="Calibri" w:hAnsi="Calibri"/>
+          <w:i/>
+          <w:iCs/>
+          <w:color w:val="8B4000"/>
+          <w:sz w:val="20"/>
+          <w:szCs w:val="20"/>
+        </w:rPr>
+        <w:t xml:space="preserve">⚠ Irreversibel. Name → [anonymisiert], Kontaktdaten gelöscht. Terminpläne bleiben anonym erhalten.</w:t>
+      </w:r>
+    </w:p>
+    <w:p>
+      <w:pPr>
+        <w:spacing w:after="80"/>
+      </w:pPr>
+      <w:r>
+        <w:t xml:space="preserve"/>
+      </w:r>
+    </w:p>
+    <w:p>
+      <w:pPr>
+        <w:pStyle w:val="Heading2"/>
+        <w:spacing w:after="80" w:before="240"/>
+      </w:pPr>
+      <w:r>
+        <w:rPr>
+          <w:rFonts w:ascii="Calibri" w:cs="Calibri" w:eastAsia="Calibri" w:hAnsi="Calibri"/>
+          <w:b/>
+          <w:bCs/>
+          <w:color w:val="3A6B8A"/>
+          <w:sz w:val="24"/>
+          <w:szCs w:val="24"/>
+        </w:rPr>
+        <w:t xml:space="preserve">6.3 Jährlicher Archivierungsjob</w:t>
+      </w:r>
+    </w:p>
+    <w:p>
+      <w:pPr>
+        <w:spacing w:after="120"/>
+      </w:pPr>
+      <w:r>
+        <w:rPr>
+          <w:rFonts w:ascii="Calibri" w:cs="Calibri" w:eastAsia="Calibri" w:hAnsi="Calibri"/>
+          <w:sz w:val="22"/>
+          <w:szCs w:val="22"/>
+        </w:rPr>
+        <w:t xml:space="preserve">Läuft automatisch jährlich (1. Januar, 03:00 Uhr). Manuell via Admin-Bereich → System → Archivierung → "Job jetzt starten".</w:t>
       </w:r>
     </w:p>
     <w:p>
@@ -4390,7 +5079,7 @@
           <w:sz w:val="20"/>
           <w:szCs w:val="20"/>
         </w:rPr>
-        <w:t xml:space="preserve">ℹ Der Export enthält alle Stammdaten, Terminbeteiligungen und Dienstplan-Einträge der Person. Audit-Log-Einträge werden gefiltert — keine Daten anderer Personen sichtbar.</w:t>
+        <w:t xml:space="preserve">ℹ Job protokolliert Lauf, Ergebnis und Anzahl gelöschter Datensätze.</w:t>
       </w:r>
     </w:p>
     <w:p>
@@ -4399,6 +5088,26 @@
       </w:pPr>
       <w:r>
         <w:t xml:space="preserve"/>
+      </w:r>
+    </w:p>
+    <w:p>
+      <w:pPr>
+        <w:pStyle w:val="Heading1"/>
+        <w:pBdr>
+          <w:bottom w:val="single" w:color="AABBD0" w:sz="4" w:space="1"/>
+        </w:pBdr>
+        <w:spacing w:after="120" w:before="400"/>
+      </w:pPr>
+      <w:r>
+        <w:rPr>
+          <w:rFonts w:ascii="Calibri" w:cs="Calibri" w:eastAsia="Calibri" w:hAnsi="Calibri"/>
+          <w:b/>
+          <w:bCs/>
+          <w:color w:val="2E4057"/>
+          <w:sz w:val="28"/>
+          <w:szCs w:val="28"/>
+        </w:rPr>
+        <w:t xml:space="preserve">7. Benutzer- und Rollenverwaltung</w:t>
       </w:r>
     </w:p>
     <w:p>
@@ -4415,494 +5124,7 @@
           <w:sz w:val="24"/>
           <w:szCs w:val="24"/>
         </w:rPr>
-        <w:t xml:space="preserve">6.2 Recht auf Vergessenwerden — Sofort-Anonymisierung</w:t>
-      </w:r>
-    </w:p>
-    <w:p>
-      <w:pPr>
-        <w:spacing w:after="120"/>
-      </w:pPr>
-      <w:r>
-        <w:rPr>
-          <w:rFonts w:ascii="Calibri" w:cs="Calibri" w:eastAsia="Calibri" w:hAnsi="Calibri"/>
-          <w:sz w:val="22"/>
-          <w:szCs w:val="22"/>
-        </w:rPr>
-        <w:t xml:space="preserve">Eine Person kann die Löschung ihrer Daten verlangen. Da historische Terminpläne erhalten bleiben müssen, wird anonymisiert statt gelöscht:</w:t>
-      </w:r>
-    </w:p>
-    <w:p>
-      <w:pPr>
-        <w:pStyle w:val="ListParagraph"/>
-        <w:numPr>
-          <w:ilvl w:val="0"/>
-          <w:numId w:val="3"/>
-        </w:numPr>
-      </w:pPr>
-      <w:r>
-        <w:rPr>
-          <w:rFonts w:ascii="Calibri" w:cs="Calibri" w:eastAsia="Calibri" w:hAnsi="Calibri"/>
-          <w:sz w:val="22"/>
-          <w:szCs w:val="22"/>
-        </w:rPr>
-        <w:t xml:space="preserve">Im Admin-Bereich einloggen</w:t>
-      </w:r>
-    </w:p>
-    <w:p>
-      <w:pPr>
-        <w:pStyle w:val="ListParagraph"/>
-        <w:numPr>
-          <w:ilvl w:val="0"/>
-          <w:numId w:val="3"/>
-        </w:numPr>
-      </w:pPr>
-      <w:r>
-        <w:rPr>
-          <w:rFonts w:ascii="Calibri" w:cs="Calibri" w:eastAsia="Calibri" w:hAnsi="Calibri"/>
-          <w:sz w:val="22"/>
-          <w:szCs w:val="22"/>
-        </w:rPr>
-        <w:t xml:space="preserve">Personen → Person suchen</w:t>
-      </w:r>
-    </w:p>
-    <w:p>
-      <w:pPr>
-        <w:pStyle w:val="ListParagraph"/>
-        <w:numPr>
-          <w:ilvl w:val="0"/>
-          <w:numId w:val="3"/>
-        </w:numPr>
-      </w:pPr>
-      <w:r>
-        <w:rPr>
-          <w:rFonts w:ascii="Calibri" w:cs="Calibri" w:eastAsia="Calibri" w:hAnsi="Calibri"/>
-          <w:sz w:val="22"/>
-          <w:szCs w:val="22"/>
-        </w:rPr>
-        <w:t xml:space="preserve">Schaltfläche "Person anonymisieren" klicken</w:t>
-      </w:r>
-    </w:p>
-    <w:p>
-      <w:pPr>
-        <w:pStyle w:val="ListParagraph"/>
-        <w:numPr>
-          <w:ilvl w:val="0"/>
-          <w:numId w:val="3"/>
-        </w:numPr>
-      </w:pPr>
-      <w:r>
-        <w:rPr>
-          <w:rFonts w:ascii="Calibri" w:cs="Calibri" w:eastAsia="Calibri" w:hAnsi="Calibri"/>
-          <w:sz w:val="22"/>
-          <w:szCs w:val="22"/>
-        </w:rPr>
-        <w:t xml:space="preserve">Bestätigung eingeben</w:t>
-      </w:r>
-    </w:p>
-    <w:p>
-      <w:pPr>
-        <w:pBdr>
-          <w:left w:val="single" w:color="E59866" w:sz="6" w:space="8"/>
-        </w:pBdr>
-        <w:spacing w:after="120" w:before="60"/>
-        <w:ind w:left="360"/>
-      </w:pPr>
-      <w:r>
-        <w:rPr>
-          <w:rFonts w:ascii="Calibri" w:cs="Calibri" w:eastAsia="Calibri" w:hAnsi="Calibri"/>
-          <w:i/>
-          <w:iCs/>
-          <w:color w:val="8B4000"/>
-          <w:sz w:val="20"/>
-          <w:szCs w:val="20"/>
-        </w:rPr>
-        <w:t xml:space="preserve">⚠ Diese Aktion ist irreversibel. Name wird zu [anonymisiert], Kontaktdaten werden gelöscht.</w:t>
-      </w:r>
-    </w:p>
-    <w:p>
-      <w:pPr>
-        <w:spacing w:after="120"/>
-      </w:pPr>
-      <w:r>
-        <w:rPr>
-          <w:rFonts w:ascii="Calibri" w:cs="Calibri" w:eastAsia="Calibri" w:hAnsi="Calibri"/>
-          <w:sz w:val="22"/>
-          <w:szCs w:val="22"/>
-        </w:rPr>
-        <w:t xml:space="preserve">Was anonymisiert wird: Stammdaten (Name, E-Mail, Telefon), alle Teilnehmer-Snapshots in Terminen, lesbare Felder im Audit Log. Was erhalten bleibt: UUIDs (für Systemintegrität), anonymisierte Terminpläne.</w:t>
-      </w:r>
-    </w:p>
-    <w:p>
-      <w:pPr>
-        <w:spacing w:after="80"/>
-      </w:pPr>
-      <w:r>
-        <w:t xml:space="preserve"/>
-      </w:r>
-    </w:p>
-    <w:p>
-      <w:pPr>
-        <w:pStyle w:val="Heading2"/>
-        <w:spacing w:after="80" w:before="240"/>
-      </w:pPr>
-      <w:r>
-        <w:rPr>
-          <w:rFonts w:ascii="Calibri" w:cs="Calibri" w:eastAsia="Calibri" w:hAnsi="Calibri"/>
-          <w:b/>
-          <w:bCs/>
-          <w:color w:val="3A6B8A"/>
-          <w:sz w:val="24"/>
-          <w:szCs w:val="24"/>
-        </w:rPr>
-        <w:t xml:space="preserve">6.3 Jährlicher Archivierungsjob</w:t>
-      </w:r>
-    </w:p>
-    <w:p>
-      <w:pPr>
-        <w:spacing w:after="120"/>
-      </w:pPr>
-      <w:r>
-        <w:rPr>
-          <w:rFonts w:ascii="Calibri" w:cs="Calibri" w:eastAsia="Calibri" w:hAnsi="Calibri"/>
-          <w:sz w:val="22"/>
-          <w:szCs w:val="22"/>
-        </w:rPr>
-        <w:t xml:space="preserve">Der Archivierungsjob läuft automatisch jährlich (1. Januar, 03:00 Uhr) und bereinigt die Produktionsdatenbank von Daten älter als 2 Jahre. Er kann auch manuell ausgelöst werden:</w:t>
-      </w:r>
-    </w:p>
-    <w:p>
-      <w:pPr>
-        <w:pStyle w:val="Heading3"/>
-        <w:spacing w:after="60" w:before="160"/>
-      </w:pPr>
-      <w:r>
-        <w:rPr>
-          <w:rFonts w:ascii="Calibri" w:cs="Calibri" w:eastAsia="Calibri" w:hAnsi="Calibri"/>
-          <w:b/>
-          <w:bCs/>
-          <w:color w:val="2E4057"/>
-          <w:sz w:val="22"/>
-          <w:szCs w:val="22"/>
-        </w:rPr>
-        <w:t xml:space="preserve">Manuell auslösen (Admin-Interface)</w:t>
-      </w:r>
-    </w:p>
-    <w:p>
-      <w:pPr>
-        <w:pStyle w:val="ListParagraph"/>
-        <w:numPr>
-          <w:ilvl w:val="0"/>
-          <w:numId w:val="3"/>
-        </w:numPr>
-      </w:pPr>
-      <w:r>
-        <w:rPr>
-          <w:rFonts w:ascii="Calibri" w:cs="Calibri" w:eastAsia="Calibri" w:hAnsi="Calibri"/>
-          <w:sz w:val="22"/>
-          <w:szCs w:val="22"/>
-        </w:rPr>
-        <w:t xml:space="preserve">Im Admin-Bereich einloggen</w:t>
-      </w:r>
-    </w:p>
-    <w:p>
-      <w:pPr>
-        <w:pStyle w:val="ListParagraph"/>
-        <w:numPr>
-          <w:ilvl w:val="0"/>
-          <w:numId w:val="3"/>
-        </w:numPr>
-      </w:pPr>
-      <w:r>
-        <w:rPr>
-          <w:rFonts w:ascii="Calibri" w:cs="Calibri" w:eastAsia="Calibri" w:hAnsi="Calibri"/>
-          <w:sz w:val="22"/>
-          <w:szCs w:val="22"/>
-        </w:rPr>
-        <w:t xml:space="preserve">System → Archivierung → "Job jetzt starten" klicken</w:t>
-      </w:r>
-    </w:p>
-    <w:p>
-      <w:pPr>
-        <w:pStyle w:val="ListParagraph"/>
-        <w:numPr>
-          <w:ilvl w:val="0"/>
-          <w:numId w:val="3"/>
-        </w:numPr>
-      </w:pPr>
-      <w:r>
-        <w:rPr>
-          <w:rFonts w:ascii="Calibri" w:cs="Calibri" w:eastAsia="Calibri" w:hAnsi="Calibri"/>
-          <w:sz w:val="22"/>
-          <w:szCs w:val="22"/>
-        </w:rPr>
-        <w:t xml:space="preserve">Status verfolgen — der Job läuft im Hintergrund</w:t>
-      </w:r>
-    </w:p>
-    <w:p>
-      <w:pPr>
-        <w:spacing w:after="80"/>
-      </w:pPr>
-      <w:r>
-        <w:t xml:space="preserve"/>
-      </w:r>
-    </w:p>
-    <w:p>
-      <w:pPr>
-        <w:pStyle w:val="Heading3"/>
-        <w:spacing w:after="60" w:before="160"/>
-      </w:pPr>
-      <w:r>
-        <w:rPr>
-          <w:rFonts w:ascii="Calibri" w:cs="Calibri" w:eastAsia="Calibri" w:hAnsi="Calibri"/>
-          <w:b/>
-          <w:bCs/>
-          <w:color w:val="2E4057"/>
-          <w:sz w:val="22"/>
-          <w:szCs w:val="22"/>
-        </w:rPr>
-        <w:t xml:space="preserve">Manuell auslösen (technisch)</w:t>
-      </w:r>
-    </w:p>
-    <w:p>
-      <w:pPr>
-        <w:spacing w:after="80" w:before="80"/>
-      </w:pPr>
-      <w:r>
-        <w:rPr>
-          <w:rFonts w:ascii="Calibri" w:cs="Calibri" w:eastAsia="Calibri" w:hAnsi="Calibri"/>
-          <w:i/>
-          <w:iCs/>
-          <w:color w:val="666666"/>
-          <w:sz w:val="18"/>
-          <w:szCs w:val="18"/>
-        </w:rPr>
-        <w:t xml:space="preserve">[ TECHNISCHER ABSCHNITT — erfordert Linux/Docker-Kenntnisse ]</w:t>
-      </w:r>
-    </w:p>
-    <w:p>
-      <w:pPr>
-        <w:shd w:fill="F0F0F0" w:val="clear"/>
-        <w:spacing w:after="40"/>
-        <w:ind w:left="480"/>
-      </w:pPr>
-      <w:r>
-        <w:rPr>
-          <w:rFonts w:ascii="Courier New" w:cs="Courier New" w:eastAsia="Courier New" w:hAnsi="Courier New"/>
-          <w:sz w:val="20"/>
-          <w:szCs w:val="20"/>
-        </w:rPr>
-        <w:t xml:space="preserve">docker compose exec app python scripts/archive_job.py --dry-run  # Test</w:t>
-      </w:r>
-    </w:p>
-    <w:p>
-      <w:pPr>
-        <w:shd w:fill="F0F0F0" w:val="clear"/>
-        <w:spacing w:after="40"/>
-        <w:ind w:left="480"/>
-      </w:pPr>
-      <w:r>
-        <w:rPr>
-          <w:rFonts w:ascii="Courier New" w:cs="Courier New" w:eastAsia="Courier New" w:hAnsi="Courier New"/>
-          <w:sz w:val="20"/>
-          <w:szCs w:val="20"/>
-        </w:rPr>
-        <w:t xml:space="preserve">docker compose exec app python scripts/archive_job.py             # Scharf</w:t>
-      </w:r>
-    </w:p>
-    <w:p>
-      <w:pPr>
-        <w:spacing w:after="80"/>
-      </w:pPr>
-      <w:r>
-        <w:t xml:space="preserve"/>
-      </w:r>
-    </w:p>
-    <w:p>
-      <w:pPr>
-        <w:spacing w:after="120"/>
-      </w:pPr>
-      <w:r>
-        <w:rPr>
-          <w:rFonts w:ascii="Calibri" w:cs="Calibri" w:eastAsia="Calibri" w:hAnsi="Calibri"/>
-          <w:sz w:val="22"/>
-          <w:szCs w:val="22"/>
-        </w:rPr>
-        <w:t xml:space="preserve">Was der Job macht: Alle Anlässe und Termine älter als 2 Jahre werden als anonymisiertes CSV exportiert, verifiziert, und dann physisch aus der Produktionsdatenbank gelöscht. Personendaten sind im Archiv nicht enthalten.</w:t>
-      </w:r>
-    </w:p>
-    <w:p>
-      <w:pPr>
-        <w:pBdr>
-          <w:left w:val="single" w:color="3A6B8A" w:sz="6" w:space="8"/>
-        </w:pBdr>
-        <w:spacing w:after="120" w:before="60"/>
-        <w:ind w:left="360"/>
-      </w:pPr>
-      <w:r>
-        <w:rPr>
-          <w:rFonts w:ascii="Calibri" w:cs="Calibri" w:eastAsia="Calibri" w:hAnsi="Calibri"/>
-          <w:i/>
-          <w:iCs/>
-          <w:color w:val="1A5276"/>
-          <w:sz w:val="20"/>
-          <w:szCs w:val="20"/>
-        </w:rPr>
-        <w:t xml:space="preserve">ℹ Der Job protokolliert Lauf, Ergebnis und Anzahl gelöschter Datensätze. Log einsehbar unter System → Archivierung → Verlauf.</w:t>
-      </w:r>
-    </w:p>
-    <w:p>
-      <w:pPr>
-        <w:spacing w:after="80"/>
-      </w:pPr>
-      <w:r>
-        <w:t xml:space="preserve"/>
-      </w:r>
-    </w:p>
-    <w:p>
-      <w:pPr>
-        <w:pStyle w:val="Heading2"/>
-        <w:spacing w:after="80" w:before="240"/>
-      </w:pPr>
-      <w:r>
-        <w:rPr>
-          <w:rFonts w:ascii="Calibri" w:cs="Calibri" w:eastAsia="Calibri" w:hAnsi="Calibri"/>
-          <w:b/>
-          <w:bCs/>
-          <w:color w:val="3A6B8A"/>
-          <w:sz w:val="24"/>
-          <w:szCs w:val="24"/>
-        </w:rPr>
-        <w:t xml:space="preserve">6.4 Datenschutz-Dokumentation</w:t>
-      </w:r>
-    </w:p>
-    <w:p>
-      <w:pPr>
-        <w:spacing w:after="120"/>
-      </w:pPr>
-      <w:r>
-        <w:rPr>
-          <w:rFonts w:ascii="Calibri" w:cs="Calibri" w:eastAsia="Calibri" w:hAnsi="Calibri"/>
-          <w:sz w:val="22"/>
-          <w:szCs w:val="22"/>
-        </w:rPr>
-        <w:t xml:space="preserve">Folgende Dokumente sollten von der Kirchgemeinde gepflegt werden:</w:t>
-      </w:r>
-    </w:p>
-    <w:p>
-      <w:pPr>
-        <w:pStyle w:val="ListParagraph"/>
-        <w:numPr>
-          <w:ilvl w:val="0"/>
-          <w:numId w:val="2"/>
-        </w:numPr>
-      </w:pPr>
-      <w:r>
-        <w:rPr>
-          <w:rFonts w:ascii="Calibri" w:cs="Calibri" w:eastAsia="Calibri" w:hAnsi="Calibri"/>
-          <w:sz w:val="22"/>
-          <w:szCs w:val="22"/>
-        </w:rPr>
-        <w:t xml:space="preserve">Verzeichnis der Verarbeitungstätigkeiten (VVT) — gesetzlich empfohlen</w:t>
-      </w:r>
-    </w:p>
-    <w:p>
-      <w:pPr>
-        <w:pStyle w:val="ListParagraph"/>
-        <w:numPr>
-          <w:ilvl w:val="0"/>
-          <w:numId w:val="2"/>
-        </w:numPr>
-      </w:pPr>
-      <w:r>
-        <w:rPr>
-          <w:rFonts w:ascii="Calibri" w:cs="Calibri" w:eastAsia="Calibri" w:hAnsi="Calibri"/>
-          <w:sz w:val="22"/>
-          <w:szCs w:val="22"/>
-        </w:rPr>
-        <w:t xml:space="preserve">Datenschutzerklärung falls das System öffentlich zugänglich ist</w:t>
-      </w:r>
-    </w:p>
-    <w:p>
-      <w:pPr>
-        <w:pStyle w:val="ListParagraph"/>
-        <w:numPr>
-          <w:ilvl w:val="0"/>
-          <w:numId w:val="2"/>
-        </w:numPr>
-      </w:pPr>
-      <w:r>
-        <w:rPr>
-          <w:rFonts w:ascii="Calibri" w:cs="Calibri" w:eastAsia="Calibri" w:hAnsi="Calibri"/>
-          <w:sz w:val="22"/>
-          <w:szCs w:val="22"/>
-        </w:rPr>
-        <w:t xml:space="preserve">Auftragsverarbeitungsvertrag (AVV) mit Infomaniak — prüfen ob vorhanden</w:t>
-      </w:r>
-    </w:p>
-    <w:p>
-      <w:pPr>
-        <w:spacing w:after="80"/>
-      </w:pPr>
-      <w:r>
-        <w:t xml:space="preserve"/>
-      </w:r>
-    </w:p>
-    <w:p>
-      <w:pPr>
-        <w:pStyle w:val="Heading1"/>
-        <w:pBdr>
-          <w:bottom w:val="single" w:color="AABBD0" w:sz="4" w:space="1"/>
-        </w:pBdr>
-        <w:spacing w:after="120" w:before="400"/>
-      </w:pPr>
-      <w:r>
-        <w:rPr>
-          <w:rFonts w:ascii="Calibri" w:cs="Calibri" w:eastAsia="Calibri" w:hAnsi="Calibri"/>
-          <w:b/>
-          <w:bCs/>
-          <w:color w:val="2E4057"/>
-          <w:sz w:val="28"/>
-          <w:szCs w:val="28"/>
-        </w:rPr>
-        <w:t xml:space="preserve">7. Benutzer- und Rollenverwaltung</w:t>
-      </w:r>
-    </w:p>
-    <w:p>
-      <w:pPr>
-        <w:spacing w:after="120"/>
-      </w:pPr>
-      <w:r>
-        <w:rPr>
-          <w:rFonts w:ascii="Calibri" w:cs="Calibri" w:eastAsia="Calibri" w:hAnsi="Calibri"/>
-          <w:sz w:val="22"/>
-          <w:szCs w:val="22"/>
-        </w:rPr>
-        <w:t xml:space="preserve">Dieser Abschnitt richtet sich an Administratoren ohne technischen Hintergrund.</w:t>
-      </w:r>
-    </w:p>
-    <w:p>
-      <w:pPr>
-        <w:spacing w:after="80"/>
-      </w:pPr>
-      <w:r>
-        <w:t xml:space="preserve"/>
-      </w:r>
-    </w:p>
-    <w:p>
-      <w:pPr>
-        <w:pStyle w:val="Heading2"/>
-        <w:spacing w:after="80" w:before="240"/>
-      </w:pPr>
-      <w:r>
-        <w:rPr>
-          <w:rFonts w:ascii="Calibri" w:cs="Calibri" w:eastAsia="Calibri" w:hAnsi="Calibri"/>
-          <w:b/>
-          <w:bCs/>
-          <w:color w:val="3A6B8A"/>
-          <w:sz w:val="24"/>
-          <w:szCs w:val="24"/>
-        </w:rPr>
-        <w:t xml:space="preserve">7.1 Rollen im Überblick</w:t>
+        <w:t xml:space="preserve">7.1 Rollen</w:t>
       </w:r>
     </w:p>
     <w:tbl>
@@ -4946,7 +5168,6 @@
                 <w:rFonts w:ascii="Calibri" w:cs="Calibri" w:eastAsia="Calibri" w:hAnsi="Calibri"/>
                 <w:b/>
                 <w:bCs/>
-                <w:color w:val="000000"/>
                 <w:sz w:val="20"/>
                 <w:szCs w:val="20"/>
               </w:rPr>
@@ -4977,7 +5198,6 @@
                 <w:rFonts w:ascii="Calibri" w:cs="Calibri" w:eastAsia="Calibri" w:hAnsi="Calibri"/>
                 <w:b/>
                 <w:bCs/>
-                <w:color w:val="000000"/>
                 <w:sz w:val="20"/>
                 <w:szCs w:val="20"/>
               </w:rPr>
@@ -5008,7 +5228,6 @@
                 <w:rFonts w:ascii="Calibri" w:cs="Calibri" w:eastAsia="Calibri" w:hAnsi="Calibri"/>
                 <w:b/>
                 <w:bCs/>
-                <w:color w:val="000000"/>
                 <w:sz w:val="20"/>
                 <w:szCs w:val="20"/>
               </w:rPr>
@@ -5041,7 +5260,6 @@
                 <w:rFonts w:ascii="Calibri" w:cs="Calibri" w:eastAsia="Calibri" w:hAnsi="Calibri"/>
                 <w:b w:val="false"/>
                 <w:bCs w:val="false"/>
-                <w:color w:val="000000"/>
                 <w:sz w:val="20"/>
                 <w:szCs w:val="20"/>
               </w:rPr>
@@ -5072,11 +5290,10 @@
                 <w:rFonts w:ascii="Calibri" w:cs="Calibri" w:eastAsia="Calibri" w:hAnsi="Calibri"/>
                 <w:b w:val="false"/>
                 <w:bCs w:val="false"/>
-                <w:color w:val="000000"/>
-                <w:sz w:val="20"/>
-                <w:szCs w:val="20"/>
-              </w:rPr>
-              <w:t xml:space="preserve">Anlässe erstellen, eigene Anlässe bearbeiten, Dienstplan eintragen</w:t>
+                <w:sz w:val="20"/>
+                <w:szCs w:val="20"/>
+              </w:rPr>
+              <w:t xml:space="preserve">Anlässe erstellen, eigene bearbeiten, Dienstplan eintragen</w:t>
             </w:r>
           </w:p>
         </w:tc>
@@ -5103,11 +5320,10 @@
                 <w:rFonts w:ascii="Calibri" w:cs="Calibri" w:eastAsia="Calibri" w:hAnsi="Calibri"/>
                 <w:b w:val="false"/>
                 <w:bCs w:val="false"/>
-                <w:color w:val="000000"/>
-                <w:sz w:val="20"/>
-                <w:szCs w:val="20"/>
-              </w:rPr>
-              <w:t xml:space="preserve">Eigene Anlässe freigeben, andere Anlässe sehen/bearbeiten</w:t>
+                <w:sz w:val="20"/>
+                <w:szCs w:val="20"/>
+              </w:rPr>
+              <w:t xml:space="preserve">Eigene Anlässe freigeben</w:t>
             </w:r>
           </w:p>
         </w:tc>
@@ -5136,7 +5352,6 @@
                 <w:rFonts w:ascii="Calibri" w:cs="Calibri" w:eastAsia="Calibri" w:hAnsi="Calibri"/>
                 <w:b w:val="false"/>
                 <w:bCs w:val="false"/>
-                <w:color w:val="000000"/>
                 <w:sz w:val="20"/>
                 <w:szCs w:val="20"/>
               </w:rPr>
@@ -5167,11 +5382,10 @@
                 <w:rFonts w:ascii="Calibri" w:cs="Calibri" w:eastAsia="Calibri" w:hAnsi="Calibri"/>
                 <w:b w:val="false"/>
                 <w:bCs w:val="false"/>
-                <w:color w:val="000000"/>
-                <w:sz w:val="20"/>
-                <w:szCs w:val="20"/>
-              </w:rPr>
-              <w:t xml:space="preserve">Alle Anlässe sehen, freigeben oder ablehnen, Personen suchen</w:t>
+                <w:sz w:val="20"/>
+                <w:szCs w:val="20"/>
+              </w:rPr>
+              <w:t xml:space="preserve">Alle Anlässe sehen, freigeben oder ablehnen</w:t>
             </w:r>
           </w:p>
         </w:tc>
@@ -5198,11 +5412,10 @@
                 <w:rFonts w:ascii="Calibri" w:cs="Calibri" w:eastAsia="Calibri" w:hAnsi="Calibri"/>
                 <w:b w:val="false"/>
                 <w:bCs w:val="false"/>
-                <w:color w:val="000000"/>
-                <w:sz w:val="20"/>
-                <w:szCs w:val="20"/>
-              </w:rPr>
-              <w:t xml:space="preserve">Benutzer verwalten, Sperrzeiten setzen, Systemeinstellungen ändern</w:t>
+                <w:sz w:val="20"/>
+                <w:szCs w:val="20"/>
+              </w:rPr>
+              <w:t xml:space="preserve">Benutzer verwalten, Sperrzeiten setzen</w:t>
             </w:r>
           </w:p>
         </w:tc>
@@ -5231,7 +5444,6 @@
                 <w:rFonts w:ascii="Calibri" w:cs="Calibri" w:eastAsia="Calibri" w:hAnsi="Calibri"/>
                 <w:b w:val="false"/>
                 <w:bCs w:val="false"/>
-                <w:color w:val="000000"/>
                 <w:sz w:val="20"/>
                 <w:szCs w:val="20"/>
               </w:rPr>
@@ -5262,11 +5474,10 @@
                 <w:rFonts w:ascii="Calibri" w:cs="Calibri" w:eastAsia="Calibri" w:hAnsi="Calibri"/>
                 <w:b w:val="false"/>
                 <w:bCs w:val="false"/>
-                <w:color w:val="000000"/>
-                <w:sz w:val="20"/>
-                <w:szCs w:val="20"/>
-              </w:rPr>
-              <w:t xml:space="preserve">Alles — Benutzer, Rollen, Sperrzeiten, Archivierung, DSG-Prozesse</w:t>
+                <w:sz w:val="20"/>
+                <w:szCs w:val="20"/>
+              </w:rPr>
+              <w:t xml:space="preserve">Alles — Benutzer, Rollen, Sperrzeiten, Archivierung, DSG</w:t>
             </w:r>
           </w:p>
         </w:tc>
@@ -5293,7 +5504,6 @@
                 <w:rFonts w:ascii="Calibri" w:cs="Calibri" w:eastAsia="Calibri" w:hAnsi="Calibri"/>
                 <w:b w:val="false"/>
                 <w:bCs w:val="false"/>
-                <w:color w:val="000000"/>
                 <w:sz w:val="20"/>
                 <w:szCs w:val="20"/>
               </w:rPr>
@@ -5328,7 +5538,7 @@
           <w:sz w:val="20"/>
           <w:szCs w:val="20"/>
         </w:rPr>
-        <w:t xml:space="preserve">ℹ Eine Person kann mehrere Rollen haben. Self-Approval ist immer verboten — wer einen Anlass erstellt hat, kann ihn nie selbst freigeben, auch nicht als Admin.</w:t>
+        <w:t xml:space="preserve">ℹ Self-Approval ist immer verboten — wer einen Anlass erstellt hat, kann ihn nie selbst freigeben, auch nicht als Admin.</w:t>
       </w:r>
     </w:p>
     <w:p>
@@ -5387,7 +5597,7 @@
           <w:sz w:val="22"/>
           <w:szCs w:val="22"/>
         </w:rPr>
-        <w:t xml:space="preserve">Person aus der Personenliste auswählen (oder zuerst neue Person erfassen)</w:t>
+        <w:t xml:space="preserve">Person auswählen oder neu erfassen</w:t>
       </w:r>
     </w:p>
     <w:p>
@@ -5404,7 +5614,7 @@
           <w:sz w:val="22"/>
           <w:szCs w:val="22"/>
         </w:rPr>
-        <w:t xml:space="preserve">E-Mail-Adresse eingeben (wird als Login verwendet)</w:t>
+        <w:t xml:space="preserve">E-Mail, temporäres Passwort und Rolle(n) eingeben</w:t>
       </w:r>
     </w:p>
     <w:p>
@@ -5421,7 +5631,32 @@
           <w:sz w:val="22"/>
           <w:szCs w:val="22"/>
         </w:rPr>
-        <w:t xml:space="preserve">Temporäres Passwort setzen (Person sollte es beim ersten Login ändern)</w:t>
+        <w:t xml:space="preserve">Speichern</w:t>
+      </w:r>
+    </w:p>
+    <w:p>
+      <w:pPr>
+        <w:spacing w:after="80"/>
+      </w:pPr>
+      <w:r>
+        <w:t xml:space="preserve"/>
+      </w:r>
+    </w:p>
+    <w:p>
+      <w:pPr>
+        <w:pStyle w:val="Heading2"/>
+        <w:spacing w:after="80" w:before="240"/>
+      </w:pPr>
+      <w:r>
+        <w:rPr>
+          <w:rFonts w:ascii="Calibri" w:cs="Calibri" w:eastAsia="Calibri" w:hAnsi="Calibri"/>
+          <w:b/>
+          <w:bCs/>
+          <w:color w:val="3A6B8A"/>
+          <w:sz w:val="24"/>
+          <w:szCs w:val="24"/>
+        </w:rPr>
+        <w:t xml:space="preserve">7.3 Benutzer deaktivieren</w:t>
       </w:r>
     </w:p>
     <w:p>
@@ -5438,7 +5673,52 @@
           <w:sz w:val="22"/>
           <w:szCs w:val="22"/>
         </w:rPr>
-        <w:t xml:space="preserve">Rolle(n) zuweisen</w:t>
+        <w:t xml:space="preserve">Admin-Bereich → Benutzer → Person suchen → "Deaktivieren"</w:t>
+      </w:r>
+    </w:p>
+    <w:p>
+      <w:pPr>
+        <w:pBdr>
+          <w:left w:val="single" w:color="3A6B8A" w:sz="6" w:space="8"/>
+        </w:pBdr>
+        <w:spacing w:after="120" w:before="60"/>
+        <w:ind w:left="360"/>
+      </w:pPr>
+      <w:r>
+        <w:rPr>
+          <w:rFonts w:ascii="Calibri" w:cs="Calibri" w:eastAsia="Calibri" w:hAnsi="Calibri"/>
+          <w:i/>
+          <w:iCs/>
+          <w:color w:val="1A5276"/>
+          <w:sz w:val="20"/>
+          <w:szCs w:val="20"/>
+        </w:rPr>
+        <w:t xml:space="preserve">ℹ Deaktivieren statt löschen bewahrt die Datenintegrität.</w:t>
+      </w:r>
+    </w:p>
+    <w:p>
+      <w:pPr>
+        <w:spacing w:after="80"/>
+      </w:pPr>
+      <w:r>
+        <w:t xml:space="preserve"/>
+      </w:r>
+    </w:p>
+    <w:p>
+      <w:pPr>
+        <w:pStyle w:val="Heading2"/>
+        <w:spacing w:after="80" w:before="240"/>
+      </w:pPr>
+      <w:r>
+        <w:rPr>
+          <w:rFonts w:ascii="Calibri" w:cs="Calibri" w:eastAsia="Calibri" w:hAnsi="Calibri"/>
+          <w:b/>
+          <w:bCs/>
+          <w:color w:val="3A6B8A"/>
+          <w:sz w:val="24"/>
+          <w:szCs w:val="24"/>
+        </w:rPr>
+        <w:t xml:space="preserve">7.4 Passwort zurücksetzen</w:t>
       </w:r>
     </w:p>
     <w:p>
@@ -5455,27 +5735,7 @@
           <w:sz w:val="22"/>
           <w:szCs w:val="22"/>
         </w:rPr>
-        <w:t xml:space="preserve">Speichern</w:t>
-      </w:r>
-    </w:p>
-    <w:p>
-      <w:pPr>
-        <w:pBdr>
-          <w:left w:val="single" w:color="3A6B8A" w:sz="6" w:space="8"/>
-        </w:pBdr>
-        <w:spacing w:after="120" w:before="60"/>
-        <w:ind w:left="360"/>
-      </w:pPr>
-      <w:r>
-        <w:rPr>
-          <w:rFonts w:ascii="Calibri" w:cs="Calibri" w:eastAsia="Calibri" w:hAnsi="Calibri"/>
-          <w:i/>
-          <w:iCs/>
-          <w:color w:val="1A5276"/>
-          <w:sz w:val="20"/>
-          <w:szCs w:val="20"/>
-        </w:rPr>
-        <w:t xml:space="preserve">ℹ Benutzername ist immer die E-Mail-Adresse. Mehrere Rollen sind möglich.</w:t>
+        <w:t xml:space="preserve">Admin-Bereich → Benutzer → Person suchen → "Passwort zurücksetzen"</w:t>
       </w:r>
     </w:p>
     <w:p>
@@ -5500,20 +5760,7 @@
           <w:sz w:val="24"/>
           <w:szCs w:val="24"/>
         </w:rPr>
-        <w:t xml:space="preserve">7.3 Benutzer deaktivieren</w:t>
-      </w:r>
-    </w:p>
-    <w:p>
-      <w:pPr>
-        <w:spacing w:after="120"/>
-      </w:pPr>
-      <w:r>
-        <w:rPr>
-          <w:rFonts w:ascii="Calibri" w:cs="Calibri" w:eastAsia="Calibri" w:hAnsi="Calibri"/>
-          <w:sz w:val="22"/>
-          <w:szCs w:val="22"/>
-        </w:rPr>
-        <w:t xml:space="preserve">Deaktivierte Benutzer können sich nicht mehr einloggen, ihre Daten bleiben erhalten:</w:t>
+        <w:t xml:space="preserve">7.5 Sperrzeiten verwalten</w:t>
       </w:r>
     </w:p>
     <w:p>
@@ -5530,7 +5777,7 @@
           <w:sz w:val="22"/>
           <w:szCs w:val="22"/>
         </w:rPr>
-        <w:t xml:space="preserve">Admin-Bereich → Benutzer → Person suchen</w:t>
+        <w:t xml:space="preserve">Admin-Bereich → Sperrzeiten → Neue Sperrzeit</w:t>
       </w:r>
     </w:p>
     <w:p>
@@ -5547,243 +5794,7 @@
           <w:sz w:val="22"/>
           <w:szCs w:val="22"/>
         </w:rPr>
-        <w:t xml:space="preserve">Schaltfläche "Deaktivieren" klicken</w:t>
-      </w:r>
-    </w:p>
-    <w:p>
-      <w:pPr>
-        <w:pStyle w:val="ListParagraph"/>
-        <w:numPr>
-          <w:ilvl w:val="0"/>
-          <w:numId w:val="3"/>
-        </w:numPr>
-      </w:pPr>
-      <w:r>
-        <w:rPr>
-          <w:rFonts w:ascii="Calibri" w:cs="Calibri" w:eastAsia="Calibri" w:hAnsi="Calibri"/>
-          <w:sz w:val="22"/>
-          <w:szCs w:val="22"/>
-        </w:rPr>
-        <w:t xml:space="preserve">Bestätigung</w:t>
-      </w:r>
-    </w:p>
-    <w:p>
-      <w:pPr>
-        <w:pBdr>
-          <w:left w:val="single" w:color="3A6B8A" w:sz="6" w:space="8"/>
-        </w:pBdr>
-        <w:spacing w:after="120" w:before="60"/>
-        <w:ind w:left="360"/>
-      </w:pPr>
-      <w:r>
-        <w:rPr>
-          <w:rFonts w:ascii="Calibri" w:cs="Calibri" w:eastAsia="Calibri" w:hAnsi="Calibri"/>
-          <w:i/>
-          <w:iCs/>
-          <w:color w:val="1A5276"/>
-          <w:sz w:val="20"/>
-          <w:szCs w:val="20"/>
-        </w:rPr>
-        <w:t xml:space="preserve">ℹ Deaktivieren statt löschen bewahrt die Datenintegrität (Anlass-History etc.).</w:t>
-      </w:r>
-    </w:p>
-    <w:p>
-      <w:pPr>
-        <w:spacing w:after="80"/>
-      </w:pPr>
-      <w:r>
-        <w:t xml:space="preserve"/>
-      </w:r>
-    </w:p>
-    <w:p>
-      <w:pPr>
-        <w:pStyle w:val="Heading2"/>
-        <w:spacing w:after="80" w:before="240"/>
-      </w:pPr>
-      <w:r>
-        <w:rPr>
-          <w:rFonts w:ascii="Calibri" w:cs="Calibri" w:eastAsia="Calibri" w:hAnsi="Calibri"/>
-          <w:b/>
-          <w:bCs/>
-          <w:color w:val="3A6B8A"/>
-          <w:sz w:val="24"/>
-          <w:szCs w:val="24"/>
-        </w:rPr>
-        <w:t xml:space="preserve">7.4 Passwort zurücksetzen</w:t>
-      </w:r>
-    </w:p>
-    <w:p>
-      <w:pPr>
-        <w:pStyle w:val="ListParagraph"/>
-        <w:numPr>
-          <w:ilvl w:val="0"/>
-          <w:numId w:val="3"/>
-        </w:numPr>
-      </w:pPr>
-      <w:r>
-        <w:rPr>
-          <w:rFonts w:ascii="Calibri" w:cs="Calibri" w:eastAsia="Calibri" w:hAnsi="Calibri"/>
-          <w:sz w:val="22"/>
-          <w:szCs w:val="22"/>
-        </w:rPr>
-        <w:t xml:space="preserve">Admin-Bereich → Benutzer → Person suchen</w:t>
-      </w:r>
-    </w:p>
-    <w:p>
-      <w:pPr>
-        <w:pStyle w:val="ListParagraph"/>
-        <w:numPr>
-          <w:ilvl w:val="0"/>
-          <w:numId w:val="3"/>
-        </w:numPr>
-      </w:pPr>
-      <w:r>
-        <w:rPr>
-          <w:rFonts w:ascii="Calibri" w:cs="Calibri" w:eastAsia="Calibri" w:hAnsi="Calibri"/>
-          <w:sz w:val="22"/>
-          <w:szCs w:val="22"/>
-        </w:rPr>
-        <w:t xml:space="preserve">Schaltfläche "Passwort zurücksetzen" klicken</w:t>
-      </w:r>
-    </w:p>
-    <w:p>
-      <w:pPr>
-        <w:pStyle w:val="ListParagraph"/>
-        <w:numPr>
-          <w:ilvl w:val="0"/>
-          <w:numId w:val="3"/>
-        </w:numPr>
-      </w:pPr>
-      <w:r>
-        <w:rPr>
-          <w:rFonts w:ascii="Calibri" w:cs="Calibri" w:eastAsia="Calibri" w:hAnsi="Calibri"/>
-          <w:sz w:val="22"/>
-          <w:szCs w:val="22"/>
-        </w:rPr>
-        <w:t xml:space="preserve">Neues temporäres Passwort eingeben</w:t>
-      </w:r>
-    </w:p>
-    <w:p>
-      <w:pPr>
-        <w:pStyle w:val="ListParagraph"/>
-        <w:numPr>
-          <w:ilvl w:val="0"/>
-          <w:numId w:val="3"/>
-        </w:numPr>
-      </w:pPr>
-      <w:r>
-        <w:rPr>
-          <w:rFonts w:ascii="Calibri" w:cs="Calibri" w:eastAsia="Calibri" w:hAnsi="Calibri"/>
-          <w:sz w:val="22"/>
-          <w:szCs w:val="22"/>
-        </w:rPr>
-        <w:t xml:space="preserve">Passwort sicher an die Person übermitteln</w:t>
-      </w:r>
-    </w:p>
-    <w:p>
-      <w:pPr>
-        <w:spacing w:after="80"/>
-      </w:pPr>
-      <w:r>
-        <w:t xml:space="preserve"/>
-      </w:r>
-    </w:p>
-    <w:p>
-      <w:pPr>
-        <w:pStyle w:val="Heading2"/>
-        <w:spacing w:after="80" w:before="240"/>
-      </w:pPr>
-      <w:r>
-        <w:rPr>
-          <w:rFonts w:ascii="Calibri" w:cs="Calibri" w:eastAsia="Calibri" w:hAnsi="Calibri"/>
-          <w:b/>
-          <w:bCs/>
-          <w:color w:val="3A6B8A"/>
-          <w:sz w:val="24"/>
-          <w:szCs w:val="24"/>
-        </w:rPr>
-        <w:t xml:space="preserve">7.5 Sperrzeiten verwalten</w:t>
-      </w:r>
-    </w:p>
-    <w:p>
-      <w:pPr>
-        <w:spacing w:after="120"/>
-      </w:pPr>
-      <w:r>
-        <w:rPr>
-          <w:rFonts w:ascii="Calibri" w:cs="Calibri" w:eastAsia="Calibri" w:hAnsi="Calibri"/>
-          <w:sz w:val="22"/>
-          <w:szCs w:val="22"/>
-        </w:rPr>
-        <w:t xml:space="preserve">Sperrzeiten verhindern, dass in einem Zeitraum Anlässe bestätigt werden können. Nur Admins können Sperrzeiten setzen und aufheben:</w:t>
-      </w:r>
-    </w:p>
-    <w:p>
-      <w:pPr>
-        <w:pStyle w:val="ListParagraph"/>
-        <w:numPr>
-          <w:ilvl w:val="0"/>
-          <w:numId w:val="3"/>
-        </w:numPr>
-      </w:pPr>
-      <w:r>
-        <w:rPr>
-          <w:rFonts w:ascii="Calibri" w:cs="Calibri" w:eastAsia="Calibri" w:hAnsi="Calibri"/>
-          <w:sz w:val="22"/>
-          <w:szCs w:val="22"/>
-        </w:rPr>
-        <w:t xml:space="preserve">Admin-Bereich → Sperrzeiten → Neue Sperrzeit</w:t>
-      </w:r>
-    </w:p>
-    <w:p>
-      <w:pPr>
-        <w:pStyle w:val="ListParagraph"/>
-        <w:numPr>
-          <w:ilvl w:val="0"/>
-          <w:numId w:val="3"/>
-        </w:numPr>
-      </w:pPr>
-      <w:r>
-        <w:rPr>
-          <w:rFonts w:ascii="Calibri" w:cs="Calibri" w:eastAsia="Calibri" w:hAnsi="Calibri"/>
-          <w:sz w:val="22"/>
-          <w:szCs w:val="22"/>
-        </w:rPr>
-        <w:t xml:space="preserve">Zeitraum und Grund eingeben</w:t>
-      </w:r>
-    </w:p>
-    <w:p>
-      <w:pPr>
-        <w:pStyle w:val="ListParagraph"/>
-        <w:numPr>
-          <w:ilvl w:val="0"/>
-          <w:numId w:val="3"/>
-        </w:numPr>
-      </w:pPr>
-      <w:r>
-        <w:rPr>
-          <w:rFonts w:ascii="Calibri" w:cs="Calibri" w:eastAsia="Calibri" w:hAnsi="Calibri"/>
-          <w:sz w:val="22"/>
-          <w:szCs w:val="22"/>
-        </w:rPr>
-        <w:t xml:space="preserve">Optional: nur für bestimmte Räume (leer = systemweit)</w:t>
-      </w:r>
-    </w:p>
-    <w:p>
-      <w:pPr>
-        <w:pStyle w:val="ListParagraph"/>
-        <w:numPr>
-          <w:ilvl w:val="0"/>
-          <w:numId w:val="3"/>
-        </w:numPr>
-      </w:pPr>
-      <w:r>
-        <w:rPr>
-          <w:rFonts w:ascii="Calibri" w:cs="Calibri" w:eastAsia="Calibri" w:hAnsi="Calibri"/>
-          <w:sz w:val="22"/>
-          <w:szCs w:val="22"/>
-        </w:rPr>
-        <w:t xml:space="preserve">Speichern</w:t>
+        <w:t xml:space="preserve">Zeitraum, Grund, optional spezifische Räume eingeben</w:t>
       </w:r>
     </w:p>
     <w:p>
@@ -5803,7 +5814,7 @@
           <w:sz w:val="20"/>
           <w:szCs w:val="20"/>
         </w:rPr>
-        <w:t xml:space="preserve">⚠ Bestehende bestätigte Anlässe in der Sperrzeit werden nicht automatisch abgesagt — das muss manuell erfolgen.</w:t>
+        <w:t xml:space="preserve">⚠ Bestehende bestätigte Anlässe werden nicht automatisch abgesagt.</w:t>
       </w:r>
     </w:p>
     <w:p>
@@ -5875,7 +5886,6 @@
                 <w:rFonts w:ascii="Calibri" w:cs="Calibri" w:eastAsia="Calibri" w:hAnsi="Calibri"/>
                 <w:b/>
                 <w:bCs/>
-                <w:color w:val="000000"/>
                 <w:sz w:val="20"/>
                 <w:szCs w:val="20"/>
               </w:rPr>
@@ -5906,7 +5916,6 @@
                 <w:rFonts w:ascii="Calibri" w:cs="Calibri" w:eastAsia="Calibri" w:hAnsi="Calibri"/>
                 <w:b/>
                 <w:bCs/>
-                <w:color w:val="000000"/>
                 <w:sz w:val="20"/>
                 <w:szCs w:val="20"/>
               </w:rPr>
@@ -5937,7 +5946,6 @@
                 <w:rFonts w:ascii="Calibri" w:cs="Calibri" w:eastAsia="Calibri" w:hAnsi="Calibri"/>
                 <w:b/>
                 <w:bCs/>
-                <w:color w:val="000000"/>
                 <w:sz w:val="20"/>
                 <w:szCs w:val="20"/>
               </w:rPr>
@@ -5970,7 +5978,6 @@
                 <w:rFonts w:ascii="Calibri" w:cs="Calibri" w:eastAsia="Calibri" w:hAnsi="Calibri"/>
                 <w:b w:val="false"/>
                 <w:bCs w:val="false"/>
-                <w:color w:val="000000"/>
                 <w:sz w:val="20"/>
                 <w:szCs w:val="20"/>
               </w:rPr>
@@ -6001,7 +6008,6 @@
                 <w:rFonts w:ascii="Calibri" w:cs="Calibri" w:eastAsia="Calibri" w:hAnsi="Calibri"/>
                 <w:b w:val="false"/>
                 <w:bCs w:val="false"/>
-                <w:color w:val="000000"/>
                 <w:sz w:val="20"/>
                 <w:szCs w:val="20"/>
               </w:rPr>
@@ -6032,7 +6038,6 @@
                 <w:rFonts w:ascii="Calibri" w:cs="Calibri" w:eastAsia="Calibri" w:hAnsi="Calibri"/>
                 <w:b w:val="false"/>
                 <w:bCs w:val="false"/>
-                <w:color w:val="000000"/>
                 <w:sz w:val="20"/>
                 <w:szCs w:val="20"/>
               </w:rPr>
@@ -6065,7 +6070,6 @@
                 <w:rFonts w:ascii="Calibri" w:cs="Calibri" w:eastAsia="Calibri" w:hAnsi="Calibri"/>
                 <w:b w:val="false"/>
                 <w:bCs w:val="false"/>
-                <w:color w:val="000000"/>
                 <w:sz w:val="20"/>
                 <w:szCs w:val="20"/>
               </w:rPr>
@@ -6096,11 +6100,10 @@
                 <w:rFonts w:ascii="Calibri" w:cs="Calibri" w:eastAsia="Calibri" w:hAnsi="Calibri"/>
                 <w:b w:val="false"/>
                 <w:bCs w:val="false"/>
-                <w:color w:val="000000"/>
-                <w:sz w:val="20"/>
-                <w:szCs w:val="20"/>
-              </w:rPr>
-              <w:t xml:space="preserve">Technischer Betreiber + Kirchgemeinde-Leitung</w:t>
+                <w:sz w:val="20"/>
+                <w:szCs w:val="20"/>
+              </w:rPr>
+              <w:t xml:space="preserve">Betreiber + Kirchgemeinde-Leitung</w:t>
             </w:r>
           </w:p>
         </w:tc>
@@ -6127,7 +6130,6 @@
                 <w:rFonts w:ascii="Calibri" w:cs="Calibri" w:eastAsia="Calibri" w:hAnsi="Calibri"/>
                 <w:b w:val="false"/>
                 <w:bCs w:val="false"/>
-                <w:color w:val="000000"/>
                 <w:sz w:val="20"/>
                 <w:szCs w:val="20"/>
               </w:rPr>
@@ -6160,7 +6162,6 @@
                 <w:rFonts w:ascii="Calibri" w:cs="Calibri" w:eastAsia="Calibri" w:hAnsi="Calibri"/>
                 <w:b w:val="false"/>
                 <w:bCs w:val="false"/>
-                <w:color w:val="000000"/>
                 <w:sz w:val="20"/>
                 <w:szCs w:val="20"/>
               </w:rPr>
@@ -6191,11 +6192,10 @@
                 <w:rFonts w:ascii="Calibri" w:cs="Calibri" w:eastAsia="Calibri" w:hAnsi="Calibri"/>
                 <w:b w:val="false"/>
                 <w:bCs w:val="false"/>
-                <w:color w:val="000000"/>
-                <w:sz w:val="20"/>
-                <w:szCs w:val="20"/>
-              </w:rPr>
-              <w:t xml:space="preserve">Administrator der Kirchgemeinde</w:t>
+                <w:sz w:val="20"/>
+                <w:szCs w:val="20"/>
+              </w:rPr>
+              <w:t xml:space="preserve">Administrator</w:t>
             </w:r>
           </w:p>
         </w:tc>
@@ -6222,7 +6222,6 @@
                 <w:rFonts w:ascii="Calibri" w:cs="Calibri" w:eastAsia="Calibri" w:hAnsi="Calibri"/>
                 <w:b w:val="false"/>
                 <w:bCs w:val="false"/>
-                <w:color w:val="000000"/>
                 <w:sz w:val="20"/>
                 <w:szCs w:val="20"/>
               </w:rPr>
@@ -6255,7 +6254,6 @@
                 <w:rFonts w:ascii="Calibri" w:cs="Calibri" w:eastAsia="Calibri" w:hAnsi="Calibri"/>
                 <w:b w:val="false"/>
                 <w:bCs w:val="false"/>
-                <w:color w:val="000000"/>
                 <w:sz w:val="20"/>
                 <w:szCs w:val="20"/>
               </w:rPr>
@@ -6286,7 +6284,6 @@
                 <w:rFonts w:ascii="Calibri" w:cs="Calibri" w:eastAsia="Calibri" w:hAnsi="Calibri"/>
                 <w:b w:val="false"/>
                 <w:bCs w:val="false"/>
-                <w:color w:val="000000"/>
                 <w:sz w:val="20"/>
                 <w:szCs w:val="20"/>
               </w:rPr>
@@ -6317,7 +6314,6 @@
                 <w:rFonts w:ascii="Calibri" w:cs="Calibri" w:eastAsia="Calibri" w:hAnsi="Calibri"/>
                 <w:b w:val="false"/>
                 <w:bCs w:val="false"/>
-                <w:color w:val="000000"/>
                 <w:sz w:val="20"/>
                 <w:szCs w:val="20"/>
               </w:rPr>
@@ -6352,7 +6348,7 @@
           <w:sz w:val="20"/>
           <w:szCs w:val="20"/>
         </w:rPr>
-        <w:t xml:space="preserve">⚠ Bei einem Sicherheitsvorfall (Datenleck, unberechtigter Zugriff) muss die betroffene Kirchgemeinde gemäss DSG Art. 24 den EDÖB benachrichtigen, wenn ein hohes Risiko für betroffene Personen besteht.</w:t>
+        <w:t xml:space="preserve">⚠ Bei Sicherheitsvorfall (Datenleck, unberechtigter Zugriff): Kirchgemeinde muss gemäss DSG Art. 24 den EDÖB benachrichtigen bei hohem Risiko für betroffene Personen.</w:t>
       </w:r>
     </w:p>
     <w:p>
@@ -6380,7 +6376,7 @@
           <w:sz w:val="18"/>
           <w:szCs w:val="18"/>
         </w:rPr>
-        <w:t xml:space="preserve">Betriebshandbuch V1.0  |  Erstellt mit KI-Unterstützung (Claude, Anthropic)</w:t>
+        <w:t xml:space="preserve">Betriebshandbuch V1.1  |  Erstellt mit KI-Unterstützung (Claude, Anthropic)</w:t>
       </w:r>
     </w:p>
     <w:sectPr>

</xml_diff>